<commit_message>
Update SDJK report document
Updated the SDJK report Word document and removed the temporary Word lock file created during editing.
</commit_message>
<xml_diff>
--- a/Word e assim/Relatório SDJK - Gonçalo Andrade.docx
+++ b/Word e assim/Relatório SDJK - Gonçalo Andrade.docx
@@ -184,37 +184,27 @@
           <w:caps/>
           <w:color w:val="7F7F7F" w:themeColor="text1" w:themeTint="80"/>
         </w:rPr>
-        <w:t xml:space="preserve">NOME DO </w:t>
-      </w:r>
-      <w:proofErr w:type="spellStart"/>
-      <w:proofErr w:type="gramStart"/>
+        <w:t>NOME DO FORMANDO:</w:t>
+      </w:r>
+      <w:r>
+        <w:rPr>
+          <w:sz w:val="12"/>
+        </w:rPr>
+        <w:t>Gonçalo Andrade</w:t>
+      </w:r>
+      <w:r>
+        <w:rPr>
+          <w:sz w:val="12"/>
+        </w:rPr>
+        <w:tab/>
+      </w:r>
       <w:r>
         <w:rPr>
           <w:b/>
           <w:caps/>
           <w:color w:val="7F7F7F" w:themeColor="text1" w:themeTint="80"/>
         </w:rPr>
-        <w:t>FORMANDO:</w:t>
-      </w:r>
-      <w:r>
-        <w:rPr>
-          <w:sz w:val="12"/>
-        </w:rPr>
-        <w:t>Gonçalo</w:t>
-      </w:r>
-      <w:proofErr w:type="spellEnd"/>
-      <w:proofErr w:type="gramEnd"/>
-      <w:r>
-        <w:rPr>
-          <w:sz w:val="12"/>
-        </w:rPr>
-        <w:t xml:space="preserve"> Andrade</w:t>
-      </w:r>
-      <w:r>
-        <w:rPr>
-          <w:sz w:val="12"/>
-        </w:rPr>
-        <w:tab/>
+        <w:t>Nº:</w:t>
       </w:r>
       <w:r>
         <w:rPr>
@@ -222,30 +212,48 @@
           <w:caps/>
           <w:color w:val="7F7F7F" w:themeColor="text1" w:themeTint="80"/>
         </w:rPr>
-        <w:t>Nº:</w:t>
-      </w:r>
+        <w:t>6</w:t>
+      </w:r>
+    </w:p>
+    <w:p>
+      <w:pPr>
+        <w:rPr>
+          <w:sz w:val="12"/>
+        </w:rPr>
+      </w:pPr>
       <w:r>
         <w:rPr>
           <w:b/>
           <w:caps/>
           <w:color w:val="7F7F7F" w:themeColor="text1" w:themeTint="80"/>
         </w:rPr>
-        <w:t>6</w:t>
-      </w:r>
-    </w:p>
-    <w:p>
-      <w:pPr>
+        <w:t>ANO:</w:t>
+      </w:r>
+      <w:r>
         <w:rPr>
           <w:sz w:val="12"/>
         </w:rPr>
-      </w:pPr>
+        <w:t xml:space="preserve"> </w:t>
+      </w:r>
+      <w:r>
+        <w:rPr>
+          <w:sz w:val="24"/>
+        </w:rPr>
+        <w:t>3º</w:t>
+      </w:r>
+      <w:r>
+        <w:rPr>
+          <w:sz w:val="12"/>
+        </w:rPr>
+        <w:tab/>
+      </w:r>
       <w:r>
         <w:rPr>
           <w:b/>
           <w:caps/>
           <w:color w:val="7F7F7F" w:themeColor="text1" w:themeTint="80"/>
         </w:rPr>
-        <w:t>ANO:</w:t>
+        <w:t>TURMA:</w:t>
       </w:r>
       <w:r>
         <w:rPr>
@@ -257,40 +265,24 @@
         <w:rPr>
           <w:sz w:val="24"/>
         </w:rPr>
-        <w:t>3º</w:t>
-      </w:r>
-      <w:r>
-        <w:rPr>
-          <w:sz w:val="12"/>
-        </w:rPr>
-        <w:tab/>
-      </w:r>
-      <w:r>
+        <w:t>T</w:t>
+      </w:r>
+      <w:r>
+        <w:rPr>
+          <w:sz w:val="24"/>
+        </w:rPr>
+        <w:t>GPSI</w:t>
+      </w:r>
+    </w:p>
+    <w:p>
+      <w:pPr>
+        <w:jc w:val="center"/>
         <w:rPr>
           <w:b/>
           <w:caps/>
           <w:color w:val="7F7F7F" w:themeColor="text1" w:themeTint="80"/>
         </w:rPr>
-        <w:t>TURMA:</w:t>
-      </w:r>
-      <w:r>
-        <w:rPr>
-          <w:sz w:val="12"/>
-        </w:rPr>
-        <w:t xml:space="preserve"> </w:t>
-      </w:r>
-      <w:r>
-        <w:rPr>
-          <w:sz w:val="24"/>
-        </w:rPr>
-        <w:t>T</w:t>
-      </w:r>
-      <w:r>
-        <w:rPr>
-          <w:sz w:val="24"/>
-        </w:rPr>
-        <w:t>GPSI</w:t>
-      </w:r>
+      </w:pPr>
     </w:p>
     <w:p>
       <w:pPr>
@@ -301,23 +293,21 @@
           <w:color w:val="7F7F7F" w:themeColor="text1" w:themeTint="80"/>
         </w:rPr>
       </w:pPr>
-    </w:p>
-    <w:p>
-      <w:pPr>
-        <w:jc w:val="center"/>
+      <w:r>
         <w:rPr>
           <w:b/>
           <w:caps/>
           <w:color w:val="7F7F7F" w:themeColor="text1" w:themeTint="80"/>
         </w:rPr>
-      </w:pPr>
+        <w:t>Data:</w:t>
+      </w:r>
       <w:r>
         <w:rPr>
           <w:b/>
           <w:caps/>
           <w:color w:val="7F7F7F" w:themeColor="text1" w:themeTint="80"/>
         </w:rPr>
-        <w:t>Data:</w:t>
+        <w:t xml:space="preserve"> </w:t>
       </w:r>
       <w:r>
         <w:rPr>
@@ -325,30 +315,22 @@
           <w:caps/>
           <w:color w:val="7F7F7F" w:themeColor="text1" w:themeTint="80"/>
         </w:rPr>
-        <w:t xml:space="preserve"> </w:t>
-      </w:r>
-      <w:r>
+        <w:t>[DATA da entrega]</w:t>
+      </w:r>
+    </w:p>
+    <w:p>
+      <w:pPr>
+        <w:jc w:val="center"/>
         <w:rPr>
           <w:b/>
           <w:caps/>
           <w:color w:val="7F7F7F" w:themeColor="text1" w:themeTint="80"/>
         </w:rPr>
-        <w:t>[DATA da entrega]</w:t>
-      </w:r>
-    </w:p>
-    <w:p>
-      <w:pPr>
-        <w:jc w:val="center"/>
-        <w:rPr>
-          <w:b/>
-          <w:caps/>
-          <w:color w:val="7F7F7F" w:themeColor="text1" w:themeTint="80"/>
-        </w:rPr>
       </w:pPr>
     </w:p>
     <w:bookmarkStart w:id="0" w:name="_Toc416172910" w:displacedByCustomXml="next"/>
-    <w:bookmarkStart w:id="1" w:name="_Toc416268416" w:displacedByCustomXml="next"/>
-    <w:bookmarkStart w:id="2" w:name="_Toc167262095" w:displacedByCustomXml="next"/>
+    <w:bookmarkStart w:id="1" w:name="_Toc167262095" w:displacedByCustomXml="next"/>
+    <w:bookmarkStart w:id="2" w:name="_Toc416268416" w:displacedByCustomXml="next"/>
     <w:sdt>
       <w:sdtPr>
         <w:rPr>
@@ -1400,70 +1382,12 @@
         <w:t>colunas</w:t>
       </w:r>
       <w:r>
-        <w:t xml:space="preserve"> onde descem bolas do topo da tela até ao fundo da tela e o jogador tem que acertar numa certa janela onde depois é julgado se acertou </w:t>
-      </w:r>
-      <w:proofErr w:type="spellStart"/>
-      <w:r>
-        <w:t>Perfect</w:t>
-      </w:r>
-      <w:proofErr w:type="spellEnd"/>
-      <w:r>
-        <w:t xml:space="preserve">, Great, </w:t>
-      </w:r>
-      <w:proofErr w:type="spellStart"/>
-      <w:r>
-        <w:t>Good</w:t>
-      </w:r>
-      <w:proofErr w:type="spellEnd"/>
-      <w:r>
-        <w:t xml:space="preserve"> ou Miss. Tomei como inspiração os jogos “</w:t>
-      </w:r>
-      <w:proofErr w:type="spellStart"/>
-      <w:r>
-        <w:t>Quaver</w:t>
-      </w:r>
-      <w:proofErr w:type="spellEnd"/>
-      <w:r>
-        <w:t>” e “</w:t>
-      </w:r>
-      <w:proofErr w:type="spellStart"/>
-      <w:proofErr w:type="gramStart"/>
-      <w:r>
-        <w:t>Osu!Mania</w:t>
-      </w:r>
-      <w:proofErr w:type="spellEnd"/>
-      <w:proofErr w:type="gramEnd"/>
-      <w:r>
-        <w:t>”, pois são do mesmo género e acho um conceito bastante interessante.</w:t>
-      </w:r>
-    </w:p>
-    <w:p>
-      <w:r>
-        <w:t xml:space="preserve">Foi desenvolvido em </w:t>
-      </w:r>
-      <w:proofErr w:type="spellStart"/>
-      <w:r>
-        <w:t>Unity</w:t>
-      </w:r>
-      <w:proofErr w:type="spellEnd"/>
-      <w:r>
-        <w:t xml:space="preserve"> 6, com a ajuda de alguns sites de outros criadores de jogos de ritmo e também com ajuda de ferramentas como Youtube, </w:t>
-      </w:r>
-      <w:proofErr w:type="spellStart"/>
-      <w:r>
-        <w:t>ChatGpt</w:t>
-      </w:r>
-      <w:proofErr w:type="spellEnd"/>
-      <w:r>
-        <w:t xml:space="preserve">, GitHub e Manual do </w:t>
-      </w:r>
-      <w:proofErr w:type="spellStart"/>
-      <w:r>
-        <w:t>Unity</w:t>
-      </w:r>
-      <w:proofErr w:type="spellEnd"/>
-      <w:r>
-        <w:t>.</w:t>
+        <w:t xml:space="preserve"> onde descem bolas do topo da tela até ao fundo da tela e o jogador tem que acertar numa certa janela onde depois é julgado se acertou Perfect, Great, Good ou Miss. Tomei como inspiração os jogos “Quaver” e “Osu!Mania”, pois são do mesmo género e acho um conceito bastante interessante.</w:t>
+      </w:r>
+    </w:p>
+    <w:p>
+      <w:r>
+        <w:t>Foi desenvolvido em Unity 6, com a ajuda de alguns sites de outros criadores de jogos de ritmo e também com ajuda de ferramentas como Youtube, ChatGpt, GitHub e Manual do Unity.</w:t>
       </w:r>
     </w:p>
     <w:p>
@@ -1538,24 +1462,11 @@
       <w:bookmarkEnd w:id="4"/>
     </w:p>
     <w:p>
-      <w:proofErr w:type="spellStart"/>
-      <w:r>
-        <w:t>Unity</w:t>
-      </w:r>
-      <w:proofErr w:type="spellEnd"/>
-      <w:r>
-        <w:t xml:space="preserve"> 6000.6.4f1</w:t>
-      </w:r>
-      <w:r>
-        <w:t xml:space="preserve"> – Desenvolvimento do jogo, dos </w:t>
-      </w:r>
-      <w:proofErr w:type="spellStart"/>
-      <w:r>
-        <w:t>assets</w:t>
-      </w:r>
-      <w:proofErr w:type="spellEnd"/>
-      <w:r>
-        <w:t xml:space="preserve"> e do HUD</w:t>
+      <w:r>
+        <w:t>Unity 6000.6.4f1</w:t>
+      </w:r>
+      <w:r>
+        <w:t xml:space="preserve"> – Desenvolvimento do jogo, dos assets e do HUD</w:t>
       </w:r>
     </w:p>
     <w:p>
@@ -1615,23 +1526,7 @@
     </w:p>
     <w:p>
       <w:r>
-        <w:t xml:space="preserve">Visual </w:t>
-      </w:r>
-      <w:proofErr w:type="spellStart"/>
-      <w:r>
-        <w:t>Studio</w:t>
-      </w:r>
-      <w:proofErr w:type="spellEnd"/>
-      <w:r>
-        <w:t xml:space="preserve"> </w:t>
-      </w:r>
-      <w:proofErr w:type="spellStart"/>
-      <w:r>
-        <w:t>Code</w:t>
-      </w:r>
-      <w:proofErr w:type="spellEnd"/>
-      <w:r>
-        <w:t xml:space="preserve"> – Desenvolvimento dos scripts do jogo</w:t>
+        <w:t>Visual Studio Code – Desenvolvimento dos scripts do jogo</w:t>
       </w:r>
     </w:p>
     <w:p>
@@ -1690,13 +1585,8 @@
       </w:r>
     </w:p>
     <w:p>
-      <w:proofErr w:type="spellStart"/>
-      <w:r>
-        <w:t>ChatGPT</w:t>
-      </w:r>
-      <w:proofErr w:type="spellEnd"/>
-      <w:r>
-        <w:t xml:space="preserve"> 6 – Organização de ideias, pesquisa e correção de erros</w:t>
+      <w:r>
+        <w:t>ChatGPT 6 – Organização de ideias, pesquisa e correção de erros</w:t>
       </w:r>
     </w:p>
     <w:p>
@@ -1816,21 +1706,8 @@
     </w:p>
     <w:p>
       <w:r>
-        <w:t xml:space="preserve">GitHub – Repositório do jogo, relatórios diários das alterações e </w:t>
-      </w:r>
-      <w:proofErr w:type="spellStart"/>
-      <w:r>
-        <w:t>releases</w:t>
-      </w:r>
-      <w:proofErr w:type="spellEnd"/>
-      <w:r>
-        <w:t xml:space="preserve"> para amigos testarem e darem </w:t>
-      </w:r>
-      <w:proofErr w:type="spellStart"/>
-      <w:r>
-        <w:t>debug</w:t>
-      </w:r>
-      <w:proofErr w:type="spellEnd"/>
+        <w:t>GitHub – Repositório do jogo, relatórios diários das alterações e releases para amigos testarem e darem debug</w:t>
+      </w:r>
     </w:p>
     <w:p>
       <w:r>
@@ -1978,31 +1855,7 @@
         <w:t>Comecei por pesquisar</w:t>
       </w:r>
       <w:r>
-        <w:t xml:space="preserve"> como fazer o sistema de BPM, jogos de ritmo são baseados num sistema de </w:t>
-      </w:r>
-      <w:proofErr w:type="spellStart"/>
-      <w:r>
-        <w:t>AudioSettings.dspTime</w:t>
-      </w:r>
-      <w:proofErr w:type="spellEnd"/>
-      <w:r>
-        <w:t xml:space="preserve">, basicamente o que acontece é que este sistema usa os segundos da música no jogo para contar o tempo passado, assim sendo mais preciso e não perdendo ritmo no meio do jogo, sendo um ritmo constante. Depois de ter este sistema criado comecei então por adicionar o UI principal do jogo como a Pontuação, Combo, Precisão e as quatro colunas. Adicionei também o input do jogador com o novo input </w:t>
-      </w:r>
-      <w:proofErr w:type="spellStart"/>
-      <w:r>
-        <w:t>system</w:t>
-      </w:r>
-      <w:proofErr w:type="spellEnd"/>
-      <w:r>
-        <w:t xml:space="preserve"> do </w:t>
-      </w:r>
-      <w:proofErr w:type="spellStart"/>
-      <w:r>
-        <w:t>unity</w:t>
-      </w:r>
-      <w:proofErr w:type="spellEnd"/>
-      <w:r>
-        <w:t xml:space="preserve"> e fiz então os inputs SDJK que corresponde cada um a uma coluna.</w:t>
+        <w:t xml:space="preserve"> como fazer o sistema de BPM, jogos de ritmo são baseados num sistema de AudioSettings.dspTime, basicamente o que acontece é que este sistema usa os segundos da música no jogo para contar o tempo passado, assim sendo mais preciso e não perdendo ritmo no meio do jogo, sendo um ritmo constante. Depois de ter este sistema criado comecei então por adicionar o UI principal do jogo como a Pontuação, Combo, Precisão e as quatro colunas. Adicionei também o input do jogador com o novo input system do unity e fiz então os inputs SDJK que corresponde cada um a uma coluna.</w:t>
       </w:r>
     </w:p>
     <w:p>
@@ -2084,34 +1937,7 @@
     </w:p>
     <w:p>
       <w:r>
-        <w:t>Adicionei também uma maneira de criar “</w:t>
-      </w:r>
-      <w:proofErr w:type="spellStart"/>
-      <w:r>
-        <w:t>Beatmaps</w:t>
-      </w:r>
-      <w:proofErr w:type="spellEnd"/>
-      <w:r>
-        <w:t>”, que são os mapas do jogo, são criados em JSON com uma estrutura especifica para o jogo.</w:t>
-      </w:r>
-      <w:r>
-        <w:t xml:space="preserve"> Como se nota na imagem abaixo os JSON são criados com duas variáveis: </w:t>
-      </w:r>
-      <w:proofErr w:type="spellStart"/>
-      <w:r>
-        <w:t>noteBeat</w:t>
-      </w:r>
-      <w:proofErr w:type="spellEnd"/>
-      <w:r>
-        <w:t xml:space="preserve"> (o beat em que a nota aparece) e </w:t>
-      </w:r>
-      <w:proofErr w:type="spellStart"/>
-      <w:r>
-        <w:t>laneIndex</w:t>
-      </w:r>
-      <w:proofErr w:type="spellEnd"/>
-      <w:r>
-        <w:t xml:space="preserve"> (a coluna em que aparece de 0 a 3).</w:t>
+        <w:t>Adicionei também uma maneira de criar “Beatmaps”, que são os mapas do jogo, são criados em JSON com uma estrutura especifica para o jogo. Como se nota na imagem abaixo os JSON são criados com duas variáveis: noteBeat (o beat em que a nota aparece) e laneIndex (a coluna em que aparece de 0 a 3).</w:t>
       </w:r>
     </w:p>
     <w:p>
@@ -2120,6 +1946,9 @@
         <w:jc w:val="center"/>
       </w:pPr>
       <w:r>
+        <w:rPr>
+          <w:noProof/>
+        </w:rPr>
         <w:drawing>
           <wp:inline distT="0" distB="0" distL="0" distR="0" wp14:anchorId="07A773F1" wp14:editId="7C95DF61">
             <wp:extent cx="5486400" cy="1413440"/>
@@ -2173,16 +2002,126 @@
         </w:r>
       </w:fldSimple>
       <w:r>
-        <w:t xml:space="preserve"> Estrutura do </w:t>
-      </w:r>
-      <w:proofErr w:type="spellStart"/>
-      <w:r>
-        <w:t>Beatmap</w:t>
-      </w:r>
-      <w:proofErr w:type="spellEnd"/>
+        <w:t xml:space="preserve"> Estrutura do Beatmap</w:t>
+      </w:r>
+    </w:p>
+    <w:p>
+      <w:r>
+        <w:lastRenderedPageBreak/>
+        <w:t>13/10/2026</w:t>
+      </w:r>
+    </w:p>
+    <w:p>
+      <w:r>
+        <w:t xml:space="preserve">Comecei a criar a cena para o menu de definições com um slider para o volume e com um botão a dizer “Go Back” que leva de volta para o menu principal. </w:t>
+      </w:r>
+    </w:p>
+    <w:p>
+      <w:pPr>
+        <w:keepNext/>
+      </w:pPr>
+      <w:r>
+        <w:drawing>
+          <wp:inline distT="0" distB="0" distL="0" distR="0" wp14:anchorId="1697DBE0" wp14:editId="1C5F2434">
+            <wp:extent cx="6120130" cy="2959100"/>
+            <wp:effectExtent l="0" t="0" r="0" b="0"/>
+            <wp:docPr id="481894555" name="Imagem 1"/>
+            <wp:cNvGraphicFramePr>
+              <a:graphicFrameLocks xmlns:a="http://schemas.openxmlformats.org/drawingml/2006/main" noChangeAspect="1"/>
+            </wp:cNvGraphicFramePr>
+            <a:graphic xmlns:a="http://schemas.openxmlformats.org/drawingml/2006/main">
+              <a:graphicData uri="http://schemas.openxmlformats.org/drawingml/2006/picture">
+                <pic:pic xmlns:pic="http://schemas.openxmlformats.org/drawingml/2006/picture">
+                  <pic:nvPicPr>
+                    <pic:cNvPr id="481894555" name=""/>
+                    <pic:cNvPicPr/>
+                  </pic:nvPicPr>
+                  <pic:blipFill>
+                    <a:blip r:embed="rId18"/>
+                    <a:stretch>
+                      <a:fillRect/>
+                    </a:stretch>
+                  </pic:blipFill>
+                  <pic:spPr>
+                    <a:xfrm>
+                      <a:off x="0" y="0"/>
+                      <a:ext cx="6120130" cy="2959100"/>
+                    </a:xfrm>
+                    <a:prstGeom prst="rect">
+                      <a:avLst/>
+                    </a:prstGeom>
+                  </pic:spPr>
+                </pic:pic>
+              </a:graphicData>
+            </a:graphic>
+          </wp:inline>
+        </w:drawing>
+      </w:r>
+    </w:p>
+    <w:p>
+      <w:pPr>
+        <w:pStyle w:val="Legenda"/>
+      </w:pPr>
+      <w:r>
+        <w:t xml:space="preserve">Figura </w:t>
+      </w:r>
+      <w:fldSimple w:instr=" SEQ Figura \* ARABIC ">
+        <w:r>
+          <w:rPr>
+            <w:noProof/>
+          </w:rPr>
+          <w:t>3</w:t>
+        </w:r>
+      </w:fldSimple>
+      <w:r>
+        <w:t xml:space="preserve"> Menu de definições</w:t>
+      </w:r>
+    </w:p>
+    <w:p>
+      <w:r>
+        <w:t>Adicionei também a função “SetMusicVolume” ao script Conductor.cs que vai servir para controlar o volume do audiosource que está associado ao script, neste caso a música que o jogador estiver a jogar no momento. Usei o Mathf.Clamp01 para o limite ser de 0 a 1 que depois vai ser traduzido para 0% - 100%. O PlayerFrefs é usado para guardas as preferências o jogador mesmo depois de fechar e voltar a abrir o jogo, não havendo a necessidade de voltar a mudar o volume.</w:t>
+      </w:r>
+    </w:p>
+    <w:p>
+      <w:r>
+        <w:drawing>
+          <wp:inline distT="0" distB="0" distL="0" distR="0" wp14:anchorId="7A6426E1" wp14:editId="6F347681">
+            <wp:extent cx="4016088" cy="1524132"/>
+            <wp:effectExtent l="0" t="0" r="3810" b="0"/>
+            <wp:docPr id="1792287886" name="Imagem 1"/>
+            <wp:cNvGraphicFramePr>
+              <a:graphicFrameLocks xmlns:a="http://schemas.openxmlformats.org/drawingml/2006/main" noChangeAspect="1"/>
+            </wp:cNvGraphicFramePr>
+            <a:graphic xmlns:a="http://schemas.openxmlformats.org/drawingml/2006/main">
+              <a:graphicData uri="http://schemas.openxmlformats.org/drawingml/2006/picture">
+                <pic:pic xmlns:pic="http://schemas.openxmlformats.org/drawingml/2006/picture">
+                  <pic:nvPicPr>
+                    <pic:cNvPr id="1792287886" name=""/>
+                    <pic:cNvPicPr/>
+                  </pic:nvPicPr>
+                  <pic:blipFill>
+                    <a:blip r:embed="rId19"/>
+                    <a:stretch>
+                      <a:fillRect/>
+                    </a:stretch>
+                  </pic:blipFill>
+                  <pic:spPr>
+                    <a:xfrm>
+                      <a:off x="0" y="0"/>
+                      <a:ext cx="4016088" cy="1524132"/>
+                    </a:xfrm>
+                    <a:prstGeom prst="rect">
+                      <a:avLst/>
+                    </a:prstGeom>
+                  </pic:spPr>
+                </pic:pic>
+              </a:graphicData>
+            </a:graphic>
+          </wp:inline>
+        </w:drawing>
+      </w:r>
     </w:p>
     <w:p/>
-    <w:p/>
     <w:p>
       <w:r>
         <w:t>O desenvolvimento é o "grosso" do trabalho de relatório e deve explicar de forma organizada, o caminho percorrido, as reflexões sobre os problemas levantados e as justificações das posições tomadas. Pode ser dividido em subtemas ou em capítulos com títulos e subtítulos.</w:t>
@@ -2196,7 +2135,11 @@
         <w:t>a grande liberdade criativa. O r</w:t>
       </w:r>
       <w:r>
-        <w:t>elatório assume assim o papel, não só de dar conta do estado final atingido pelo projeto, mas também de dar conhecimento ao leitor do processo de conceção e das principais opções tomadas no decurso desse trabalho.</w:t>
+        <w:t xml:space="preserve">elatório </w:t>
+      </w:r>
+      <w:r>
+        <w:lastRenderedPageBreak/>
+        <w:t>assume assim o papel, não só de dar conta do estado final atingido pelo projeto, mas também de dar conhecimento ao leitor do processo de conceção e das principais opções tomadas no decurso desse trabalho.</w:t>
       </w:r>
     </w:p>
     <w:p>
@@ -2243,15 +2186,7 @@
         </w:numPr>
       </w:pPr>
       <w:r>
-        <w:t xml:space="preserve">recorrer </w:t>
-      </w:r>
-      <w:proofErr w:type="gramStart"/>
-      <w:r>
-        <w:t>a</w:t>
-      </w:r>
-      <w:proofErr w:type="gramEnd"/>
-      <w:r>
-        <w:t xml:space="preserve"> documentação técnica e a abstrações para apresentar e documentar a solução desenvolvida e a sua arquitetura</w:t>
+        <w:t>recorrer a documentação técnica e a abstrações para apresentar e documentar a solução desenvolvida e a sua arquitetura</w:t>
       </w:r>
       <w:r>
         <w:t>.</w:t>
@@ -2641,19 +2576,11 @@
       <w:r>
         <w:t xml:space="preserve">uando forem 3 ou mais, indicar o nome do primeiro, seguido da expressão </w:t>
       </w:r>
-      <w:proofErr w:type="spellStart"/>
       <w:r>
         <w:rPr>
           <w:i/>
         </w:rPr>
-        <w:t>et</w:t>
-      </w:r>
-      <w:proofErr w:type="spellEnd"/>
-      <w:r>
-        <w:rPr>
-          <w:i/>
-        </w:rPr>
-        <w:t xml:space="preserve"> al.</w:t>
+        <w:t>et al.</w:t>
       </w:r>
       <w:r>
         <w:t xml:space="preserve"> </w:t>
@@ -2678,21 +2605,12 @@
           <w:lang w:val="en-US"/>
         </w:rPr>
       </w:pPr>
-      <w:proofErr w:type="spellStart"/>
       <w:r>
         <w:rPr>
           <w:b/>
           <w:lang w:val="en-US"/>
         </w:rPr>
-        <w:t>Exemplo</w:t>
-      </w:r>
-      <w:proofErr w:type="spellEnd"/>
-      <w:r>
-        <w:rPr>
-          <w:b/>
-          <w:lang w:val="en-US"/>
-        </w:rPr>
-        <w:t xml:space="preserve"> 2:</w:t>
+        <w:t>Exemplo 2:</w:t>
       </w:r>
     </w:p>
     <w:p>
@@ -2748,7 +2666,7 @@
         </w:rPr>
         <w:t xml:space="preserve">Acedido em 31 de julho de 2012 através de </w:t>
       </w:r>
-      <w:hyperlink r:id="rId18" w:anchor="reader_1412975417" w:history="1">
+      <w:hyperlink r:id="rId20" w:anchor="reader_1412975417" w:history="1">
         <w:r>
           <w:rPr>
             <w:rStyle w:val="Hiperligao"/>
@@ -2854,13 +2772,8 @@
         <w:t>projeto</w:t>
       </w:r>
       <w:r>
-        <w:t xml:space="preserve"> em Project ou Open </w:t>
-      </w:r>
-      <w:proofErr w:type="spellStart"/>
-      <w:r>
-        <w:t>Proj</w:t>
-      </w:r>
-      <w:proofErr w:type="spellEnd"/>
+        <w:t xml:space="preserve"> em Project ou Open Proj</w:t>
+      </w:r>
     </w:p>
     <w:p>
       <w:r>
@@ -3006,15 +2919,7 @@
     </w:p>
     <w:p>
       <w:r>
-        <w:t xml:space="preserve">As frases utilizadas devem ser </w:t>
-      </w:r>
-      <w:proofErr w:type="gramStart"/>
-      <w:r>
-        <w:t>completas</w:t>
-      </w:r>
-      <w:proofErr w:type="gramEnd"/>
-      <w:r>
-        <w:t xml:space="preserve"> mas sucintas, para que, através da sua leitura seja possível seguir um raciocínio lógico. A forma como o texto é escrito é importante para a qualidade do relatório. </w:t>
+        <w:t xml:space="preserve">As frases utilizadas devem ser completas mas sucintas, para que, através da sua leitura seja possível seguir um raciocínio lógico. A forma como o texto é escrito é importante para a qualidade do relatório. </w:t>
       </w:r>
     </w:p>
     <w:p>
@@ -3022,16 +2927,11 @@
         <w:t>Em primeiro lugar,</w:t>
       </w:r>
       <w:r>
-        <w:t xml:space="preserve"> a ausência de erros (gramaticais e de ortografia) é essencial. A primeira impressão de quem lê um texto é dada pela correção formal do texto. </w:t>
-      </w:r>
-      <w:proofErr w:type="gramStart"/>
-      <w:r>
-        <w:t xml:space="preserve">Um texto com </w:t>
+        <w:t xml:space="preserve"> a ausência de erros (gramaticais e de ortografia) é essencial. A primeira impressão de quem lê um texto é dada pela correção formal do texto. Um texto com </w:t>
       </w:r>
       <w:r>
         <w:t>erros em nada abonam</w:t>
       </w:r>
-      <w:proofErr w:type="gramEnd"/>
       <w:r>
         <w:t xml:space="preserve"> a favor de </w:t>
       </w:r>
@@ -3043,10 +2943,10 @@
       </w:r>
     </w:p>
     <w:sectPr>
-      <w:headerReference w:type="default" r:id="rId19"/>
-      <w:footerReference w:type="default" r:id="rId20"/>
-      <w:headerReference w:type="first" r:id="rId21"/>
-      <w:footerReference w:type="first" r:id="rId22"/>
+      <w:headerReference w:type="default" r:id="rId21"/>
+      <w:footerReference w:type="default" r:id="rId22"/>
+      <w:headerReference w:type="first" r:id="rId23"/>
+      <w:footerReference w:type="first" r:id="rId24"/>
       <w:type w:val="continuous"/>
       <w:pgSz w:w="11906" w:h="16838"/>
       <w:pgMar w:top="1134" w:right="1134" w:bottom="1134" w:left="1134" w:header="709" w:footer="709" w:gutter="0"/>

</xml_diff>

<commit_message>
Add settings menu and scene navigation
This change introduces a Settings screen with a volume slider that persists music volume in PlayerPrefs, and updates the conductor defaults to use the saved value. It also adds navigation from the main menu and beatmap list to the settings screen, plus a Main Menu button back from the beatmap list. The scene wiring and related Unity objects were updated to support the new flow.
</commit_message>
<xml_diff>
--- a/Word e assim/Relatório SDJK - Gonçalo Andrade.docx
+++ b/Word e assim/Relatório SDJK - Gonçalo Andrade.docx
@@ -184,27 +184,35 @@
           <w:caps/>
           <w:color w:val="7F7F7F" w:themeColor="text1" w:themeTint="80"/>
         </w:rPr>
-        <w:t>NOME DO FORMANDO:</w:t>
-      </w:r>
-      <w:r>
-        <w:rPr>
-          <w:sz w:val="12"/>
-        </w:rPr>
-        <w:t>Gonçalo Andrade</w:t>
-      </w:r>
-      <w:r>
-        <w:rPr>
-          <w:sz w:val="12"/>
-        </w:rPr>
-        <w:tab/>
-      </w:r>
+        <w:t xml:space="preserve">NOME DO </w:t>
+      </w:r>
+      <w:proofErr w:type="spellStart"/>
       <w:r>
         <w:rPr>
           <w:b/>
           <w:caps/>
           <w:color w:val="7F7F7F" w:themeColor="text1" w:themeTint="80"/>
         </w:rPr>
-        <w:t>Nº:</w:t>
+        <w:t>FORMANDO:</w:t>
+      </w:r>
+      <w:r>
+        <w:rPr>
+          <w:sz w:val="12"/>
+        </w:rPr>
+        <w:t>Gonçalo</w:t>
+      </w:r>
+      <w:proofErr w:type="spellEnd"/>
+      <w:r>
+        <w:rPr>
+          <w:sz w:val="12"/>
+        </w:rPr>
+        <w:t xml:space="preserve"> Andrade</w:t>
+      </w:r>
+      <w:r>
+        <w:rPr>
+          <w:sz w:val="12"/>
+        </w:rPr>
+        <w:tab/>
       </w:r>
       <w:r>
         <w:rPr>
@@ -212,48 +220,30 @@
           <w:caps/>
           <w:color w:val="7F7F7F" w:themeColor="text1" w:themeTint="80"/>
         </w:rPr>
-        <w:t>6</w:t>
-      </w:r>
-    </w:p>
-    <w:p>
-      <w:pPr>
-        <w:rPr>
-          <w:sz w:val="12"/>
-        </w:rPr>
-      </w:pPr>
+        <w:t>Nº:</w:t>
+      </w:r>
       <w:r>
         <w:rPr>
           <w:b/>
           <w:caps/>
           <w:color w:val="7F7F7F" w:themeColor="text1" w:themeTint="80"/>
         </w:rPr>
-        <w:t>ANO:</w:t>
-      </w:r>
-      <w:r>
+        <w:t>6</w:t>
+      </w:r>
+    </w:p>
+    <w:p>
+      <w:pPr>
         <w:rPr>
           <w:sz w:val="12"/>
         </w:rPr>
-        <w:t xml:space="preserve"> </w:t>
-      </w:r>
-      <w:r>
-        <w:rPr>
-          <w:sz w:val="24"/>
-        </w:rPr>
-        <w:t>3º</w:t>
-      </w:r>
-      <w:r>
-        <w:rPr>
-          <w:sz w:val="12"/>
-        </w:rPr>
-        <w:tab/>
-      </w:r>
+      </w:pPr>
       <w:r>
         <w:rPr>
           <w:b/>
           <w:caps/>
           <w:color w:val="7F7F7F" w:themeColor="text1" w:themeTint="80"/>
         </w:rPr>
-        <w:t>TURMA:</w:t>
+        <w:t>ANO:</w:t>
       </w:r>
       <w:r>
         <w:rPr>
@@ -265,24 +255,40 @@
         <w:rPr>
           <w:sz w:val="24"/>
         </w:rPr>
-        <w:t>T</w:t>
-      </w:r>
-      <w:r>
-        <w:rPr>
-          <w:sz w:val="24"/>
-        </w:rPr>
-        <w:t>GPSI</w:t>
-      </w:r>
-    </w:p>
-    <w:p>
-      <w:pPr>
-        <w:jc w:val="center"/>
+        <w:t>3º</w:t>
+      </w:r>
+      <w:r>
+        <w:rPr>
+          <w:sz w:val="12"/>
+        </w:rPr>
+        <w:tab/>
+      </w:r>
+      <w:r>
         <w:rPr>
           <w:b/>
           <w:caps/>
           <w:color w:val="7F7F7F" w:themeColor="text1" w:themeTint="80"/>
         </w:rPr>
-      </w:pPr>
+        <w:t>TURMA:</w:t>
+      </w:r>
+      <w:r>
+        <w:rPr>
+          <w:sz w:val="12"/>
+        </w:rPr>
+        <w:t xml:space="preserve"> </w:t>
+      </w:r>
+      <w:r>
+        <w:rPr>
+          <w:sz w:val="24"/>
+        </w:rPr>
+        <w:t>T</w:t>
+      </w:r>
+      <w:r>
+        <w:rPr>
+          <w:sz w:val="24"/>
+        </w:rPr>
+        <w:t>GPSI</w:t>
+      </w:r>
     </w:p>
     <w:p>
       <w:pPr>
@@ -293,21 +299,23 @@
           <w:color w:val="7F7F7F" w:themeColor="text1" w:themeTint="80"/>
         </w:rPr>
       </w:pPr>
-      <w:r>
+    </w:p>
+    <w:p>
+      <w:pPr>
+        <w:jc w:val="center"/>
         <w:rPr>
           <w:b/>
           <w:caps/>
           <w:color w:val="7F7F7F" w:themeColor="text1" w:themeTint="80"/>
         </w:rPr>
-        <w:t>Data:</w:t>
-      </w:r>
+      </w:pPr>
       <w:r>
         <w:rPr>
           <w:b/>
           <w:caps/>
           <w:color w:val="7F7F7F" w:themeColor="text1" w:themeTint="80"/>
         </w:rPr>
-        <w:t xml:space="preserve"> </w:t>
+        <w:t>Data:</w:t>
       </w:r>
       <w:r>
         <w:rPr>
@@ -315,22 +323,30 @@
           <w:caps/>
           <w:color w:val="7F7F7F" w:themeColor="text1" w:themeTint="80"/>
         </w:rPr>
-        <w:t>[DATA da entrega]</w:t>
-      </w:r>
-    </w:p>
-    <w:p>
-      <w:pPr>
-        <w:jc w:val="center"/>
+        <w:t xml:space="preserve"> </w:t>
+      </w:r>
+      <w:r>
         <w:rPr>
           <w:b/>
           <w:caps/>
           <w:color w:val="7F7F7F" w:themeColor="text1" w:themeTint="80"/>
         </w:rPr>
+        <w:t>[DATA da entrega]</w:t>
+      </w:r>
+    </w:p>
+    <w:p>
+      <w:pPr>
+        <w:jc w:val="center"/>
+        <w:rPr>
+          <w:b/>
+          <w:caps/>
+          <w:color w:val="7F7F7F" w:themeColor="text1" w:themeTint="80"/>
+        </w:rPr>
       </w:pPr>
     </w:p>
     <w:bookmarkStart w:id="0" w:name="_Toc416172910" w:displacedByCustomXml="next"/>
-    <w:bookmarkStart w:id="1" w:name="_Toc167262095" w:displacedByCustomXml="next"/>
-    <w:bookmarkStart w:id="2" w:name="_Toc416268416" w:displacedByCustomXml="next"/>
+    <w:bookmarkStart w:id="1" w:name="_Toc416268416" w:displacedByCustomXml="next"/>
+    <w:bookmarkStart w:id="2" w:name="_Toc167262095" w:displacedByCustomXml="next"/>
     <w:sdt>
       <w:sdtPr>
         <w:rPr>
@@ -1382,12 +1398,68 @@
         <w:t>colunas</w:t>
       </w:r>
       <w:r>
-        <w:t xml:space="preserve"> onde descem bolas do topo da tela até ao fundo da tela e o jogador tem que acertar numa certa janela onde depois é julgado se acertou Perfect, Great, Good ou Miss. Tomei como inspiração os jogos “Quaver” e “Osu!Mania”, pois são do mesmo género e acho um conceito bastante interessante.</w:t>
-      </w:r>
-    </w:p>
-    <w:p>
-      <w:r>
-        <w:t>Foi desenvolvido em Unity 6, com a ajuda de alguns sites de outros criadores de jogos de ritmo e também com ajuda de ferramentas como Youtube, ChatGpt, GitHub e Manual do Unity.</w:t>
+        <w:t xml:space="preserve"> onde descem bolas do topo da tela até ao fundo da tela e o jogador tem que acertar numa certa janela onde depois é julgado se acertou </w:t>
+      </w:r>
+      <w:proofErr w:type="spellStart"/>
+      <w:r>
+        <w:t>Perfect</w:t>
+      </w:r>
+      <w:proofErr w:type="spellEnd"/>
+      <w:r>
+        <w:t xml:space="preserve">, Great, </w:t>
+      </w:r>
+      <w:proofErr w:type="spellStart"/>
+      <w:r>
+        <w:t>Good</w:t>
+      </w:r>
+      <w:proofErr w:type="spellEnd"/>
+      <w:r>
+        <w:t xml:space="preserve"> ou Miss. Tomei como inspiração os jogos “</w:t>
+      </w:r>
+      <w:proofErr w:type="spellStart"/>
+      <w:r>
+        <w:t>Quaver</w:t>
+      </w:r>
+      <w:proofErr w:type="spellEnd"/>
+      <w:r>
+        <w:t>” e “</w:t>
+      </w:r>
+      <w:proofErr w:type="spellStart"/>
+      <w:r>
+        <w:t>Osu!Mania</w:t>
+      </w:r>
+      <w:proofErr w:type="spellEnd"/>
+      <w:r>
+        <w:t>”, pois são do mesmo género e acho um conceito bastante interessante.</w:t>
+      </w:r>
+    </w:p>
+    <w:p>
+      <w:r>
+        <w:t xml:space="preserve">Foi desenvolvido em </w:t>
+      </w:r>
+      <w:proofErr w:type="spellStart"/>
+      <w:r>
+        <w:t>Unity</w:t>
+      </w:r>
+      <w:proofErr w:type="spellEnd"/>
+      <w:r>
+        <w:t xml:space="preserve"> 6, com a ajuda de alguns sites de outros criadores de jogos de ritmo e também com ajuda de ferramentas como Youtube, </w:t>
+      </w:r>
+      <w:proofErr w:type="spellStart"/>
+      <w:r>
+        <w:t>ChatGpt</w:t>
+      </w:r>
+      <w:proofErr w:type="spellEnd"/>
+      <w:r>
+        <w:t xml:space="preserve">, GitHub e Manual do </w:t>
+      </w:r>
+      <w:proofErr w:type="spellStart"/>
+      <w:r>
+        <w:t>Unity</w:t>
+      </w:r>
+      <w:proofErr w:type="spellEnd"/>
+      <w:r>
+        <w:t>.</w:t>
       </w:r>
     </w:p>
     <w:p>
@@ -1462,11 +1534,24 @@
       <w:bookmarkEnd w:id="4"/>
     </w:p>
     <w:p>
-      <w:r>
-        <w:t>Unity 6000.6.4f1</w:t>
-      </w:r>
-      <w:r>
-        <w:t xml:space="preserve"> – Desenvolvimento do jogo, dos assets e do HUD</w:t>
+      <w:proofErr w:type="spellStart"/>
+      <w:r>
+        <w:t>Unity</w:t>
+      </w:r>
+      <w:proofErr w:type="spellEnd"/>
+      <w:r>
+        <w:t xml:space="preserve"> 6000.6.4f1</w:t>
+      </w:r>
+      <w:r>
+        <w:t xml:space="preserve"> – Desenvolvimento do jogo, dos </w:t>
+      </w:r>
+      <w:proofErr w:type="spellStart"/>
+      <w:r>
+        <w:t>assets</w:t>
+      </w:r>
+      <w:proofErr w:type="spellEnd"/>
+      <w:r>
+        <w:t xml:space="preserve"> e do HUD</w:t>
       </w:r>
     </w:p>
     <w:p>
@@ -1526,7 +1611,23 @@
     </w:p>
     <w:p>
       <w:r>
-        <w:t>Visual Studio Code – Desenvolvimento dos scripts do jogo</w:t>
+        <w:t xml:space="preserve">Visual </w:t>
+      </w:r>
+      <w:proofErr w:type="spellStart"/>
+      <w:r>
+        <w:t>Studio</w:t>
+      </w:r>
+      <w:proofErr w:type="spellEnd"/>
+      <w:r>
+        <w:t xml:space="preserve"> </w:t>
+      </w:r>
+      <w:proofErr w:type="spellStart"/>
+      <w:r>
+        <w:t>Code</w:t>
+      </w:r>
+      <w:proofErr w:type="spellEnd"/>
+      <w:r>
+        <w:t xml:space="preserve"> – Desenvolvimento dos scripts do jogo</w:t>
       </w:r>
     </w:p>
     <w:p>
@@ -1585,8 +1686,13 @@
       </w:r>
     </w:p>
     <w:p>
-      <w:r>
-        <w:t>ChatGPT 6 – Organização de ideias, pesquisa e correção de erros</w:t>
+      <w:proofErr w:type="spellStart"/>
+      <w:r>
+        <w:t>ChatGPT</w:t>
+      </w:r>
+      <w:proofErr w:type="spellEnd"/>
+      <w:r>
+        <w:t xml:space="preserve"> 6 – Organização de ideias, pesquisa e correção de erros</w:t>
       </w:r>
     </w:p>
     <w:p>
@@ -1706,8 +1812,21 @@
     </w:p>
     <w:p>
       <w:r>
-        <w:t>GitHub – Repositório do jogo, relatórios diários das alterações e releases para amigos testarem e darem debug</w:t>
-      </w:r>
+        <w:t xml:space="preserve">GitHub – Repositório do jogo, relatórios diários das alterações e </w:t>
+      </w:r>
+      <w:proofErr w:type="spellStart"/>
+      <w:r>
+        <w:t>releases</w:t>
+      </w:r>
+      <w:proofErr w:type="spellEnd"/>
+      <w:r>
+        <w:t xml:space="preserve"> para amigos testarem e darem </w:t>
+      </w:r>
+      <w:proofErr w:type="spellStart"/>
+      <w:r>
+        <w:t>debug</w:t>
+      </w:r>
+      <w:proofErr w:type="spellEnd"/>
     </w:p>
     <w:p>
       <w:r>
@@ -1855,7 +1974,31 @@
         <w:t>Comecei por pesquisar</w:t>
       </w:r>
       <w:r>
-        <w:t xml:space="preserve"> como fazer o sistema de BPM, jogos de ritmo são baseados num sistema de AudioSettings.dspTime, basicamente o que acontece é que este sistema usa os segundos da música no jogo para contar o tempo passado, assim sendo mais preciso e não perdendo ritmo no meio do jogo, sendo um ritmo constante. Depois de ter este sistema criado comecei então por adicionar o UI principal do jogo como a Pontuação, Combo, Precisão e as quatro colunas. Adicionei também o input do jogador com o novo input system do unity e fiz então os inputs SDJK que corresponde cada um a uma coluna.</w:t>
+        <w:t xml:space="preserve"> como fazer o sistema de BPM, jogos de ritmo são baseados num sistema de </w:t>
+      </w:r>
+      <w:proofErr w:type="spellStart"/>
+      <w:r>
+        <w:t>AudioSettings.dspTime</w:t>
+      </w:r>
+      <w:proofErr w:type="spellEnd"/>
+      <w:r>
+        <w:t xml:space="preserve">, basicamente o que acontece é que este sistema usa os segundos da música no jogo para contar o tempo passado, assim sendo mais preciso e não perdendo ritmo no meio do jogo, sendo um ritmo constante. Depois de ter este sistema criado comecei então por adicionar o UI principal do jogo como a Pontuação, Combo, Precisão e as quatro colunas. Adicionei também o input do jogador com o novo input </w:t>
+      </w:r>
+      <w:proofErr w:type="spellStart"/>
+      <w:r>
+        <w:t>system</w:t>
+      </w:r>
+      <w:proofErr w:type="spellEnd"/>
+      <w:r>
+        <w:t xml:space="preserve"> do </w:t>
+      </w:r>
+      <w:proofErr w:type="spellStart"/>
+      <w:r>
+        <w:t>unity</w:t>
+      </w:r>
+      <w:proofErr w:type="spellEnd"/>
+      <w:r>
+        <w:t xml:space="preserve"> e fiz então os inputs SDJK que corresponde cada um a uma coluna.</w:t>
       </w:r>
     </w:p>
     <w:p>
@@ -1937,7 +2080,31 @@
     </w:p>
     <w:p>
       <w:r>
-        <w:t>Adicionei também uma maneira de criar “Beatmaps”, que são os mapas do jogo, são criados em JSON com uma estrutura especifica para o jogo. Como se nota na imagem abaixo os JSON são criados com duas variáveis: noteBeat (o beat em que a nota aparece) e laneIndex (a coluna em que aparece de 0 a 3).</w:t>
+        <w:t>Adicionei também uma maneira de criar “</w:t>
+      </w:r>
+      <w:proofErr w:type="spellStart"/>
+      <w:r>
+        <w:t>Beatmaps</w:t>
+      </w:r>
+      <w:proofErr w:type="spellEnd"/>
+      <w:r>
+        <w:t xml:space="preserve">”, que são os mapas do jogo, são criados em JSON com uma estrutura especifica para o jogo. Como se nota na imagem abaixo os JSON são criados com duas variáveis: </w:t>
+      </w:r>
+      <w:proofErr w:type="spellStart"/>
+      <w:r>
+        <w:t>noteBeat</w:t>
+      </w:r>
+      <w:proofErr w:type="spellEnd"/>
+      <w:r>
+        <w:t xml:space="preserve"> (o beat em que a nota aparece) e </w:t>
+      </w:r>
+      <w:proofErr w:type="spellStart"/>
+      <w:r>
+        <w:t>laneIndex</w:t>
+      </w:r>
+      <w:proofErr w:type="spellEnd"/>
+      <w:r>
+        <w:t xml:space="preserve"> (a coluna em que aparece de 0 a 3).</w:t>
       </w:r>
     </w:p>
     <w:p>
@@ -2002,8 +2169,13 @@
         </w:r>
       </w:fldSimple>
       <w:r>
-        <w:t xml:space="preserve"> Estrutura do Beatmap</w:t>
-      </w:r>
+        <w:t xml:space="preserve"> Estrutura do </w:t>
+      </w:r>
+      <w:proofErr w:type="spellStart"/>
+      <w:r>
+        <w:t>Beatmap</w:t>
+      </w:r>
+      <w:proofErr w:type="spellEnd"/>
     </w:p>
     <w:p>
       <w:r>
@@ -2013,7 +2185,31 @@
     </w:p>
     <w:p>
       <w:r>
-        <w:t xml:space="preserve">Comecei a criar a cena para o menu de definições com um slider para o volume e com um botão a dizer “Go Back” que leva de volta para o menu principal. </w:t>
+        <w:t xml:space="preserve">Comecei a criar a cena para o menu de definições com um </w:t>
+      </w:r>
+      <w:proofErr w:type="spellStart"/>
+      <w:r>
+        <w:t>slider</w:t>
+      </w:r>
+      <w:proofErr w:type="spellEnd"/>
+      <w:r>
+        <w:t xml:space="preserve"> para o volume e com um botão a dizer “</w:t>
+      </w:r>
+      <w:proofErr w:type="spellStart"/>
+      <w:r>
+        <w:t>Go</w:t>
+      </w:r>
+      <w:proofErr w:type="spellEnd"/>
+      <w:r>
+        <w:t xml:space="preserve"> </w:t>
+      </w:r>
+      <w:proofErr w:type="spellStart"/>
+      <w:r>
+        <w:t>Back</w:t>
+      </w:r>
+      <w:proofErr w:type="spellEnd"/>
+      <w:r>
+        <w:t xml:space="preserve">” que leva de volta para o menu principal. </w:t>
       </w:r>
     </w:p>
     <w:p>
@@ -2021,6 +2217,9 @@
         <w:keepNext/>
       </w:pPr>
       <w:r>
+        <w:rPr>
+          <w:noProof/>
+        </w:rPr>
         <w:drawing>
           <wp:inline distT="0" distB="0" distL="0" distR="0" wp14:anchorId="1697DBE0" wp14:editId="1C5F2434">
             <wp:extent cx="6120130" cy="2959100"/>
@@ -2079,11 +2278,46 @@
     </w:p>
     <w:p>
       <w:r>
-        <w:t>Adicionei também a função “SetMusicVolume” ao script Conductor.cs que vai servir para controlar o volume do audiosource que está associado ao script, neste caso a música que o jogador estiver a jogar no momento. Usei o Mathf.Clamp01 para o limite ser de 0 a 1 que depois vai ser traduzido para 0% - 100%. O PlayerFrefs é usado para guardas as preferências o jogador mesmo depois de fechar e voltar a abrir o jogo, não havendo a necessidade de voltar a mudar o volume.</w:t>
-      </w:r>
-    </w:p>
-    <w:p>
-      <w:r>
+        <w:t>Adicionei também a função “</w:t>
+      </w:r>
+      <w:proofErr w:type="spellStart"/>
+      <w:r>
+        <w:t>SetMusicVolume</w:t>
+      </w:r>
+      <w:proofErr w:type="spellEnd"/>
+      <w:r>
+        <w:t xml:space="preserve">” ao script </w:t>
+      </w:r>
+      <w:proofErr w:type="spellStart"/>
+      <w:r>
+        <w:t>Conductor.cs</w:t>
+      </w:r>
+      <w:proofErr w:type="spellEnd"/>
+      <w:r>
+        <w:t xml:space="preserve"> que vai servir para controlar o volume do </w:t>
+      </w:r>
+      <w:proofErr w:type="spellStart"/>
+      <w:r>
+        <w:t>audiosource</w:t>
+      </w:r>
+      <w:proofErr w:type="spellEnd"/>
+      <w:r>
+        <w:t xml:space="preserve"> que está associado ao script, neste caso a música que o jogador estiver a jogar no momento. Usei o Mathf.Clamp01 para o limite ser de 0 a 1 que depois vai ser traduzido para 0% - 100%. O </w:t>
+      </w:r>
+      <w:proofErr w:type="spellStart"/>
+      <w:r>
+        <w:t>PlayerFrefs</w:t>
+      </w:r>
+      <w:proofErr w:type="spellEnd"/>
+      <w:r>
+        <w:t xml:space="preserve"> é usado para guardas as preferências o jogador mesmo depois de fechar e voltar a abrir o jogo, não havendo a necessidade de voltar a mudar o volume.</w:t>
+      </w:r>
+    </w:p>
+    <w:p>
+      <w:r>
+        <w:rPr>
+          <w:noProof/>
+        </w:rPr>
         <w:drawing>
           <wp:inline distT="0" distB="0" distL="0" distR="0" wp14:anchorId="7A6426E1" wp14:editId="6F347681">
             <wp:extent cx="4016088" cy="1524132"/>
@@ -2122,6 +2356,139 @@
       </w:r>
     </w:p>
     <w:p/>
+    <w:p/>
+    <w:p/>
+    <w:p/>
+    <w:p/>
+    <w:p>
+      <w:r>
+        <w:lastRenderedPageBreak/>
+        <w:t>16/10/2026</w:t>
+      </w:r>
+    </w:p>
+    <w:p>
+      <w:r>
+        <w:t xml:space="preserve">Acabei as definições de volume na cena </w:t>
+      </w:r>
+      <w:proofErr w:type="spellStart"/>
+      <w:r>
+        <w:t>Settings</w:t>
+      </w:r>
+      <w:proofErr w:type="spellEnd"/>
+      <w:r>
+        <w:t xml:space="preserve"> e criei o script </w:t>
+      </w:r>
+      <w:proofErr w:type="spellStart"/>
+      <w:r>
+        <w:t>SettingsMenu.cs</w:t>
+      </w:r>
+      <w:proofErr w:type="spellEnd"/>
+      <w:r>
+        <w:t xml:space="preserve"> que faz a alteração do </w:t>
+      </w:r>
+      <w:proofErr w:type="spellStart"/>
+      <w:r>
+        <w:t>slider</w:t>
+      </w:r>
+      <w:proofErr w:type="spellEnd"/>
+      <w:r>
+        <w:t xml:space="preserve"> do volume e atribui o valor do </w:t>
+      </w:r>
+      <w:proofErr w:type="spellStart"/>
+      <w:r>
+        <w:t>slider</w:t>
+      </w:r>
+      <w:proofErr w:type="spellEnd"/>
+      <w:r>
+        <w:t xml:space="preserve"> aos </w:t>
+      </w:r>
+      <w:proofErr w:type="spellStart"/>
+      <w:r>
+        <w:t>PlayerPrefs</w:t>
+      </w:r>
+      <w:proofErr w:type="spellEnd"/>
+      <w:r>
+        <w:t xml:space="preserve"> para ficar guardado mesmo depois de mudar de cena ou mesmo de sair do jogo. Adicionei também um botão para voltar ao menu principal na cena de escolha do </w:t>
+      </w:r>
+      <w:proofErr w:type="spellStart"/>
+      <w:r>
+        <w:t>Beatmap</w:t>
+      </w:r>
+      <w:proofErr w:type="spellEnd"/>
+      <w:r>
+        <w:t>.</w:t>
+      </w:r>
+    </w:p>
+    <w:p>
+      <w:pPr>
+        <w:keepNext/>
+      </w:pPr>
+      <w:r>
+        <w:drawing>
+          <wp:inline distT="0" distB="0" distL="0" distR="0" wp14:anchorId="30F66925" wp14:editId="2AAB6779">
+            <wp:extent cx="6120130" cy="2865755"/>
+            <wp:effectExtent l="0" t="0" r="0" b="0"/>
+            <wp:docPr id="1671745908" name="Imagem 1"/>
+            <wp:cNvGraphicFramePr>
+              <a:graphicFrameLocks xmlns:a="http://schemas.openxmlformats.org/drawingml/2006/main" noChangeAspect="1"/>
+            </wp:cNvGraphicFramePr>
+            <a:graphic xmlns:a="http://schemas.openxmlformats.org/drawingml/2006/main">
+              <a:graphicData uri="http://schemas.openxmlformats.org/drawingml/2006/picture">
+                <pic:pic xmlns:pic="http://schemas.openxmlformats.org/drawingml/2006/picture">
+                  <pic:nvPicPr>
+                    <pic:cNvPr id="1671745908" name=""/>
+                    <pic:cNvPicPr/>
+                  </pic:nvPicPr>
+                  <pic:blipFill>
+                    <a:blip r:embed="rId20"/>
+                    <a:stretch>
+                      <a:fillRect/>
+                    </a:stretch>
+                  </pic:blipFill>
+                  <pic:spPr>
+                    <a:xfrm>
+                      <a:off x="0" y="0"/>
+                      <a:ext cx="6120130" cy="2865755"/>
+                    </a:xfrm>
+                    <a:prstGeom prst="rect">
+                      <a:avLst/>
+                    </a:prstGeom>
+                  </pic:spPr>
+                </pic:pic>
+              </a:graphicData>
+            </a:graphic>
+          </wp:inline>
+        </w:drawing>
+      </w:r>
+    </w:p>
+    <w:p>
+      <w:pPr>
+        <w:pStyle w:val="Legenda"/>
+      </w:pPr>
+      <w:r>
+        <w:t xml:space="preserve">Figura </w:t>
+      </w:r>
+      <w:fldSimple w:instr=" SEQ Figura \* ARABIC ">
+        <w:r>
+          <w:rPr>
+            <w:noProof/>
+          </w:rPr>
+          <w:t>4</w:t>
+        </w:r>
+      </w:fldSimple>
+      <w:r>
+        <w:t xml:space="preserve"> Escolha do </w:t>
+      </w:r>
+      <w:proofErr w:type="spellStart"/>
+      <w:r>
+        <w:t>Beatmap</w:t>
+      </w:r>
+      <w:proofErr w:type="spellEnd"/>
+    </w:p>
+    <w:p/>
+    <w:p/>
+    <w:p/>
+    <w:p/>
     <w:p>
       <w:r>
         <w:t>O desenvolvimento é o "grosso" do trabalho de relatório e deve explicar de forma organizada, o caminho percorrido, as reflexões sobre os problemas levantados e as justificações das posições tomadas. Pode ser dividido em subtemas ou em capítulos com títulos e subtítulos.</w:t>
@@ -2135,11 +2502,7 @@
         <w:t>a grande liberdade criativa. O r</w:t>
       </w:r>
       <w:r>
-        <w:t xml:space="preserve">elatório </w:t>
-      </w:r>
-      <w:r>
-        <w:lastRenderedPageBreak/>
-        <w:t>assume assim o papel, não só de dar conta do estado final atingido pelo projeto, mas também de dar conhecimento ao leitor do processo de conceção e das principais opções tomadas no decurso desse trabalho.</w:t>
+        <w:t>elatório assume assim o papel, não só de dar conta do estado final atingido pelo projeto, mas também de dar conhecimento ao leitor do processo de conceção e das principais opções tomadas no decurso desse trabalho.</w:t>
       </w:r>
     </w:p>
     <w:p>
@@ -2174,6 +2537,7 @@
         </w:numPr>
       </w:pPr>
       <w:r>
+        <w:lastRenderedPageBreak/>
         <w:t>justificar devidamente as opções tomadas no decurso do projeto, apresentando, quando tal for relevante, as várias opções que estavam disponíveis, aquela que foi selecionada e os critérios que presidiram a essa escolha;</w:t>
       </w:r>
     </w:p>
@@ -2576,11 +2940,19 @@
       <w:r>
         <w:t xml:space="preserve">uando forem 3 ou mais, indicar o nome do primeiro, seguido da expressão </w:t>
       </w:r>
+      <w:proofErr w:type="spellStart"/>
       <w:r>
         <w:rPr>
           <w:i/>
         </w:rPr>
-        <w:t>et al.</w:t>
+        <w:t>et</w:t>
+      </w:r>
+      <w:proofErr w:type="spellEnd"/>
+      <w:r>
+        <w:rPr>
+          <w:i/>
+        </w:rPr>
+        <w:t xml:space="preserve"> al.</w:t>
       </w:r>
       <w:r>
         <w:t xml:space="preserve"> </w:t>
@@ -2605,12 +2977,21 @@
           <w:lang w:val="en-US"/>
         </w:rPr>
       </w:pPr>
+      <w:proofErr w:type="spellStart"/>
       <w:r>
         <w:rPr>
           <w:b/>
           <w:lang w:val="en-US"/>
         </w:rPr>
-        <w:t>Exemplo 2:</w:t>
+        <w:t>Exemplo</w:t>
+      </w:r>
+      <w:proofErr w:type="spellEnd"/>
+      <w:r>
+        <w:rPr>
+          <w:b/>
+          <w:lang w:val="en-US"/>
+        </w:rPr>
+        <w:t xml:space="preserve"> 2:</w:t>
       </w:r>
     </w:p>
     <w:p>
@@ -2666,7 +3047,7 @@
         </w:rPr>
         <w:t xml:space="preserve">Acedido em 31 de julho de 2012 através de </w:t>
       </w:r>
-      <w:hyperlink r:id="rId20" w:anchor="reader_1412975417" w:history="1">
+      <w:hyperlink r:id="rId21" w:anchor="reader_1412975417" w:history="1">
         <w:r>
           <w:rPr>
             <w:rStyle w:val="Hiperligao"/>
@@ -2772,8 +3153,13 @@
         <w:t>projeto</w:t>
       </w:r>
       <w:r>
-        <w:t xml:space="preserve"> em Project ou Open Proj</w:t>
-      </w:r>
+        <w:t xml:space="preserve"> em Project ou Open </w:t>
+      </w:r>
+      <w:proofErr w:type="spellStart"/>
+      <w:r>
+        <w:t>Proj</w:t>
+      </w:r>
+      <w:proofErr w:type="spellEnd"/>
     </w:p>
     <w:p>
       <w:r>
@@ -2943,10 +3329,10 @@
       </w:r>
     </w:p>
     <w:sectPr>
-      <w:headerReference w:type="default" r:id="rId21"/>
-      <w:footerReference w:type="default" r:id="rId22"/>
-      <w:headerReference w:type="first" r:id="rId23"/>
-      <w:footerReference w:type="first" r:id="rId24"/>
+      <w:headerReference w:type="default" r:id="rId22"/>
+      <w:footerReference w:type="default" r:id="rId23"/>
+      <w:headerReference w:type="first" r:id="rId24"/>
+      <w:footerReference w:type="first" r:id="rId25"/>
       <w:type w:val="continuous"/>
       <w:pgSz w:w="11906" w:h="16838"/>
       <w:pgMar w:top="1134" w:right="1134" w:bottom="1134" w:left="1134" w:header="709" w:footer="709" w:gutter="0"/>

</xml_diff>

<commit_message>
Add beatmap editor interface
Add a beatmap editor scene with a beatmap selector and BPM/offset details, and adjust score scaling based on combo. Update the project report.
</commit_message>
<xml_diff>
--- a/Word e assim/Relatório SDJK - Gonçalo Andrade.docx
+++ b/Word e assim/Relatório SDJK - Gonçalo Andrade.docx
@@ -184,35 +184,27 @@
           <w:caps/>
           <w:color w:val="7F7F7F" w:themeColor="text1" w:themeTint="80"/>
         </w:rPr>
-        <w:t xml:space="preserve">NOME DO </w:t>
-      </w:r>
-      <w:proofErr w:type="spellStart"/>
+        <w:t>NOME DO FORMANDO:</w:t>
+      </w:r>
+      <w:r>
+        <w:rPr>
+          <w:sz w:val="12"/>
+        </w:rPr>
+        <w:t>Gonçalo Andrade</w:t>
+      </w:r>
+      <w:r>
+        <w:rPr>
+          <w:sz w:val="12"/>
+        </w:rPr>
+        <w:tab/>
+      </w:r>
       <w:r>
         <w:rPr>
           <w:b/>
           <w:caps/>
           <w:color w:val="7F7F7F" w:themeColor="text1" w:themeTint="80"/>
         </w:rPr>
-        <w:t>FORMANDO:</w:t>
-      </w:r>
-      <w:r>
-        <w:rPr>
-          <w:sz w:val="12"/>
-        </w:rPr>
-        <w:t>Gonçalo</w:t>
-      </w:r>
-      <w:proofErr w:type="spellEnd"/>
-      <w:r>
-        <w:rPr>
-          <w:sz w:val="12"/>
-        </w:rPr>
-        <w:t xml:space="preserve"> Andrade</w:t>
-      </w:r>
-      <w:r>
-        <w:rPr>
-          <w:sz w:val="12"/>
-        </w:rPr>
-        <w:tab/>
+        <w:t>Nº:</w:t>
       </w:r>
       <w:r>
         <w:rPr>
@@ -220,30 +212,48 @@
           <w:caps/>
           <w:color w:val="7F7F7F" w:themeColor="text1" w:themeTint="80"/>
         </w:rPr>
-        <w:t>Nº:</w:t>
-      </w:r>
+        <w:t>6</w:t>
+      </w:r>
+    </w:p>
+    <w:p>
+      <w:pPr>
+        <w:rPr>
+          <w:sz w:val="12"/>
+        </w:rPr>
+      </w:pPr>
       <w:r>
         <w:rPr>
           <w:b/>
           <w:caps/>
           <w:color w:val="7F7F7F" w:themeColor="text1" w:themeTint="80"/>
         </w:rPr>
-        <w:t>6</w:t>
-      </w:r>
-    </w:p>
-    <w:p>
-      <w:pPr>
+        <w:t>ANO:</w:t>
+      </w:r>
+      <w:r>
         <w:rPr>
           <w:sz w:val="12"/>
         </w:rPr>
-      </w:pPr>
+        <w:t xml:space="preserve"> </w:t>
+      </w:r>
+      <w:r>
+        <w:rPr>
+          <w:sz w:val="24"/>
+        </w:rPr>
+        <w:t>3º</w:t>
+      </w:r>
+      <w:r>
+        <w:rPr>
+          <w:sz w:val="12"/>
+        </w:rPr>
+        <w:tab/>
+      </w:r>
       <w:r>
         <w:rPr>
           <w:b/>
           <w:caps/>
           <w:color w:val="7F7F7F" w:themeColor="text1" w:themeTint="80"/>
         </w:rPr>
-        <w:t>ANO:</w:t>
+        <w:t>TURMA:</w:t>
       </w:r>
       <w:r>
         <w:rPr>
@@ -255,40 +265,24 @@
         <w:rPr>
           <w:sz w:val="24"/>
         </w:rPr>
-        <w:t>3º</w:t>
-      </w:r>
-      <w:r>
-        <w:rPr>
-          <w:sz w:val="12"/>
-        </w:rPr>
-        <w:tab/>
-      </w:r>
-      <w:r>
+        <w:t>T</w:t>
+      </w:r>
+      <w:r>
+        <w:rPr>
+          <w:sz w:val="24"/>
+        </w:rPr>
+        <w:t>GPSI</w:t>
+      </w:r>
+    </w:p>
+    <w:p>
+      <w:pPr>
+        <w:jc w:val="center"/>
         <w:rPr>
           <w:b/>
           <w:caps/>
           <w:color w:val="7F7F7F" w:themeColor="text1" w:themeTint="80"/>
         </w:rPr>
-        <w:t>TURMA:</w:t>
-      </w:r>
-      <w:r>
-        <w:rPr>
-          <w:sz w:val="12"/>
-        </w:rPr>
-        <w:t xml:space="preserve"> </w:t>
-      </w:r>
-      <w:r>
-        <w:rPr>
-          <w:sz w:val="24"/>
-        </w:rPr>
-        <w:t>T</w:t>
-      </w:r>
-      <w:r>
-        <w:rPr>
-          <w:sz w:val="24"/>
-        </w:rPr>
-        <w:t>GPSI</w:t>
-      </w:r>
+      </w:pPr>
     </w:p>
     <w:p>
       <w:pPr>
@@ -299,23 +293,21 @@
           <w:color w:val="7F7F7F" w:themeColor="text1" w:themeTint="80"/>
         </w:rPr>
       </w:pPr>
-    </w:p>
-    <w:p>
-      <w:pPr>
-        <w:jc w:val="center"/>
+      <w:r>
         <w:rPr>
           <w:b/>
           <w:caps/>
           <w:color w:val="7F7F7F" w:themeColor="text1" w:themeTint="80"/>
         </w:rPr>
-      </w:pPr>
+        <w:t>Data:</w:t>
+      </w:r>
       <w:r>
         <w:rPr>
           <w:b/>
           <w:caps/>
           <w:color w:val="7F7F7F" w:themeColor="text1" w:themeTint="80"/>
         </w:rPr>
-        <w:t>Data:</w:t>
+        <w:t xml:space="preserve"> </w:t>
       </w:r>
       <w:r>
         <w:rPr>
@@ -323,30 +315,22 @@
           <w:caps/>
           <w:color w:val="7F7F7F" w:themeColor="text1" w:themeTint="80"/>
         </w:rPr>
-        <w:t xml:space="preserve"> </w:t>
-      </w:r>
-      <w:r>
+        <w:t>[DATA da entrega]</w:t>
+      </w:r>
+    </w:p>
+    <w:p>
+      <w:pPr>
+        <w:jc w:val="center"/>
         <w:rPr>
           <w:b/>
           <w:caps/>
           <w:color w:val="7F7F7F" w:themeColor="text1" w:themeTint="80"/>
         </w:rPr>
-        <w:t>[DATA da entrega]</w:t>
-      </w:r>
-    </w:p>
-    <w:p>
-      <w:pPr>
-        <w:jc w:val="center"/>
-        <w:rPr>
-          <w:b/>
-          <w:caps/>
-          <w:color w:val="7F7F7F" w:themeColor="text1" w:themeTint="80"/>
-        </w:rPr>
       </w:pPr>
     </w:p>
     <w:bookmarkStart w:id="0" w:name="_Toc416172910" w:displacedByCustomXml="next"/>
-    <w:bookmarkStart w:id="1" w:name="_Toc416268416" w:displacedByCustomXml="next"/>
-    <w:bookmarkStart w:id="2" w:name="_Toc167262095" w:displacedByCustomXml="next"/>
+    <w:bookmarkStart w:id="1" w:name="_Toc167262095" w:displacedByCustomXml="next"/>
+    <w:bookmarkStart w:id="2" w:name="_Toc416268416" w:displacedByCustomXml="next"/>
     <w:sdt>
       <w:sdtPr>
         <w:rPr>
@@ -1398,68 +1382,12 @@
         <w:t>colunas</w:t>
       </w:r>
       <w:r>
-        <w:t xml:space="preserve"> onde descem bolas do topo da tela até ao fundo da tela e o jogador tem que acertar numa certa janela onde depois é julgado se acertou </w:t>
-      </w:r>
-      <w:proofErr w:type="spellStart"/>
-      <w:r>
-        <w:t>Perfect</w:t>
-      </w:r>
-      <w:proofErr w:type="spellEnd"/>
-      <w:r>
-        <w:t xml:space="preserve">, Great, </w:t>
-      </w:r>
-      <w:proofErr w:type="spellStart"/>
-      <w:r>
-        <w:t>Good</w:t>
-      </w:r>
-      <w:proofErr w:type="spellEnd"/>
-      <w:r>
-        <w:t xml:space="preserve"> ou Miss. Tomei como inspiração os jogos “</w:t>
-      </w:r>
-      <w:proofErr w:type="spellStart"/>
-      <w:r>
-        <w:t>Quaver</w:t>
-      </w:r>
-      <w:proofErr w:type="spellEnd"/>
-      <w:r>
-        <w:t>” e “</w:t>
-      </w:r>
-      <w:proofErr w:type="spellStart"/>
-      <w:r>
-        <w:t>Osu!Mania</w:t>
-      </w:r>
-      <w:proofErr w:type="spellEnd"/>
-      <w:r>
-        <w:t>”, pois são do mesmo género e acho um conceito bastante interessante.</w:t>
-      </w:r>
-    </w:p>
-    <w:p>
-      <w:r>
-        <w:t xml:space="preserve">Foi desenvolvido em </w:t>
-      </w:r>
-      <w:proofErr w:type="spellStart"/>
-      <w:r>
-        <w:t>Unity</w:t>
-      </w:r>
-      <w:proofErr w:type="spellEnd"/>
-      <w:r>
-        <w:t xml:space="preserve"> 6, com a ajuda de alguns sites de outros criadores de jogos de ritmo e também com ajuda de ferramentas como Youtube, </w:t>
-      </w:r>
-      <w:proofErr w:type="spellStart"/>
-      <w:r>
-        <w:t>ChatGpt</w:t>
-      </w:r>
-      <w:proofErr w:type="spellEnd"/>
-      <w:r>
-        <w:t xml:space="preserve">, GitHub e Manual do </w:t>
-      </w:r>
-      <w:proofErr w:type="spellStart"/>
-      <w:r>
-        <w:t>Unity</w:t>
-      </w:r>
-      <w:proofErr w:type="spellEnd"/>
-      <w:r>
-        <w:t>.</w:t>
+        <w:t xml:space="preserve"> onde descem bolas do topo da tela até ao fundo da tela e o jogador tem que acertar numa certa janela onde depois é julgado se acertou Perfect, Great, Good ou Miss. Tomei como inspiração os jogos “Quaver” e “Osu!Mania”, pois são do mesmo género e acho um conceito bastante interessante.</w:t>
+      </w:r>
+    </w:p>
+    <w:p>
+      <w:r>
+        <w:t>Foi desenvolvido em Unity 6, com a ajuda de alguns sites de outros criadores de jogos de ritmo e também com ajuda de ferramentas como Youtube, ChatGpt, GitHub e Manual do Unity.</w:t>
       </w:r>
     </w:p>
     <w:p>
@@ -1534,24 +1462,11 @@
       <w:bookmarkEnd w:id="4"/>
     </w:p>
     <w:p>
-      <w:proofErr w:type="spellStart"/>
-      <w:r>
-        <w:t>Unity</w:t>
-      </w:r>
-      <w:proofErr w:type="spellEnd"/>
-      <w:r>
-        <w:t xml:space="preserve"> 6000.6.4f1</w:t>
-      </w:r>
-      <w:r>
-        <w:t xml:space="preserve"> – Desenvolvimento do jogo, dos </w:t>
-      </w:r>
-      <w:proofErr w:type="spellStart"/>
-      <w:r>
-        <w:t>assets</w:t>
-      </w:r>
-      <w:proofErr w:type="spellEnd"/>
-      <w:r>
-        <w:t xml:space="preserve"> e do HUD</w:t>
+      <w:r>
+        <w:t>Unity 6000.6.4f1</w:t>
+      </w:r>
+      <w:r>
+        <w:t xml:space="preserve"> – Desenvolvimento do jogo, dos assets e do HUD</w:t>
       </w:r>
     </w:p>
     <w:p>
@@ -1611,23 +1526,7 @@
     </w:p>
     <w:p>
       <w:r>
-        <w:t xml:space="preserve">Visual </w:t>
-      </w:r>
-      <w:proofErr w:type="spellStart"/>
-      <w:r>
-        <w:t>Studio</w:t>
-      </w:r>
-      <w:proofErr w:type="spellEnd"/>
-      <w:r>
-        <w:t xml:space="preserve"> </w:t>
-      </w:r>
-      <w:proofErr w:type="spellStart"/>
-      <w:r>
-        <w:t>Code</w:t>
-      </w:r>
-      <w:proofErr w:type="spellEnd"/>
-      <w:r>
-        <w:t xml:space="preserve"> – Desenvolvimento dos scripts do jogo</w:t>
+        <w:t>Visual Studio Code – Desenvolvimento dos scripts do jogo</w:t>
       </w:r>
     </w:p>
     <w:p>
@@ -1686,13 +1585,8 @@
       </w:r>
     </w:p>
     <w:p>
-      <w:proofErr w:type="spellStart"/>
-      <w:r>
-        <w:t>ChatGPT</w:t>
-      </w:r>
-      <w:proofErr w:type="spellEnd"/>
-      <w:r>
-        <w:t xml:space="preserve"> 6 – Organização de ideias, pesquisa e correção de erros</w:t>
+      <w:r>
+        <w:t>ChatGPT 6 – Organização de ideias, pesquisa e correção de erros</w:t>
       </w:r>
     </w:p>
     <w:p>
@@ -1812,21 +1706,8 @@
     </w:p>
     <w:p>
       <w:r>
-        <w:t xml:space="preserve">GitHub – Repositório do jogo, relatórios diários das alterações e </w:t>
-      </w:r>
-      <w:proofErr w:type="spellStart"/>
-      <w:r>
-        <w:t>releases</w:t>
-      </w:r>
-      <w:proofErr w:type="spellEnd"/>
-      <w:r>
-        <w:t xml:space="preserve"> para amigos testarem e darem </w:t>
-      </w:r>
-      <w:proofErr w:type="spellStart"/>
-      <w:r>
-        <w:t>debug</w:t>
-      </w:r>
-      <w:proofErr w:type="spellEnd"/>
+        <w:t>GitHub – Repositório do jogo, relatórios diários das alterações e releases para amigos testarem e darem debug</w:t>
+      </w:r>
     </w:p>
     <w:p>
       <w:r>
@@ -1974,31 +1855,7 @@
         <w:t>Comecei por pesquisar</w:t>
       </w:r>
       <w:r>
-        <w:t xml:space="preserve"> como fazer o sistema de BPM, jogos de ritmo são baseados num sistema de </w:t>
-      </w:r>
-      <w:proofErr w:type="spellStart"/>
-      <w:r>
-        <w:t>AudioSettings.dspTime</w:t>
-      </w:r>
-      <w:proofErr w:type="spellEnd"/>
-      <w:r>
-        <w:t xml:space="preserve">, basicamente o que acontece é que este sistema usa os segundos da música no jogo para contar o tempo passado, assim sendo mais preciso e não perdendo ritmo no meio do jogo, sendo um ritmo constante. Depois de ter este sistema criado comecei então por adicionar o UI principal do jogo como a Pontuação, Combo, Precisão e as quatro colunas. Adicionei também o input do jogador com o novo input </w:t>
-      </w:r>
-      <w:proofErr w:type="spellStart"/>
-      <w:r>
-        <w:t>system</w:t>
-      </w:r>
-      <w:proofErr w:type="spellEnd"/>
-      <w:r>
-        <w:t xml:space="preserve"> do </w:t>
-      </w:r>
-      <w:proofErr w:type="spellStart"/>
-      <w:r>
-        <w:t>unity</w:t>
-      </w:r>
-      <w:proofErr w:type="spellEnd"/>
-      <w:r>
-        <w:t xml:space="preserve"> e fiz então os inputs SDJK que corresponde cada um a uma coluna.</w:t>
+        <w:t xml:space="preserve"> como fazer o sistema de BPM, jogos de ritmo são baseados num sistema de AudioSettings.dspTime, basicamente o que acontece é que este sistema usa os segundos da música no jogo para contar o tempo passado, assim sendo mais preciso e não perdendo ritmo no meio do jogo, sendo um ritmo constante. Depois de ter este sistema criado comecei então por adicionar o UI principal do jogo como a Pontuação, Combo, Precisão e as quatro colunas. Adicionei também o input do jogador com o novo input system do unity e fiz então os inputs SDJK que corresponde cada um a uma coluna.</w:t>
       </w:r>
     </w:p>
     <w:p>
@@ -2080,31 +1937,7 @@
     </w:p>
     <w:p>
       <w:r>
-        <w:t>Adicionei também uma maneira de criar “</w:t>
-      </w:r>
-      <w:proofErr w:type="spellStart"/>
-      <w:r>
-        <w:t>Beatmaps</w:t>
-      </w:r>
-      <w:proofErr w:type="spellEnd"/>
-      <w:r>
-        <w:t xml:space="preserve">”, que são os mapas do jogo, são criados em JSON com uma estrutura especifica para o jogo. Como se nota na imagem abaixo os JSON são criados com duas variáveis: </w:t>
-      </w:r>
-      <w:proofErr w:type="spellStart"/>
-      <w:r>
-        <w:t>noteBeat</w:t>
-      </w:r>
-      <w:proofErr w:type="spellEnd"/>
-      <w:r>
-        <w:t xml:space="preserve"> (o beat em que a nota aparece) e </w:t>
-      </w:r>
-      <w:proofErr w:type="spellStart"/>
-      <w:r>
-        <w:t>laneIndex</w:t>
-      </w:r>
-      <w:proofErr w:type="spellEnd"/>
-      <w:r>
-        <w:t xml:space="preserve"> (a coluna em que aparece de 0 a 3).</w:t>
+        <w:t>Adicionei também uma maneira de criar “Beatmaps”, que são os mapas do jogo, são criados em JSON com uma estrutura especifica para o jogo. Como se nota na imagem abaixo os JSON são criados com duas variáveis: noteBeat (o beat em que a nota aparece) e laneIndex (a coluna em que aparece de 0 a 3).</w:t>
       </w:r>
     </w:p>
     <w:p>
@@ -2169,13 +2002,8 @@
         </w:r>
       </w:fldSimple>
       <w:r>
-        <w:t xml:space="preserve"> Estrutura do </w:t>
-      </w:r>
-      <w:proofErr w:type="spellStart"/>
-      <w:r>
-        <w:t>Beatmap</w:t>
-      </w:r>
-      <w:proofErr w:type="spellEnd"/>
+        <w:t xml:space="preserve"> Estrutura do Beatmap</w:t>
+      </w:r>
     </w:p>
     <w:p>
       <w:r>
@@ -2185,31 +2013,7 @@
     </w:p>
     <w:p>
       <w:r>
-        <w:t xml:space="preserve">Comecei a criar a cena para o menu de definições com um </w:t>
-      </w:r>
-      <w:proofErr w:type="spellStart"/>
-      <w:r>
-        <w:t>slider</w:t>
-      </w:r>
-      <w:proofErr w:type="spellEnd"/>
-      <w:r>
-        <w:t xml:space="preserve"> para o volume e com um botão a dizer “</w:t>
-      </w:r>
-      <w:proofErr w:type="spellStart"/>
-      <w:r>
-        <w:t>Go</w:t>
-      </w:r>
-      <w:proofErr w:type="spellEnd"/>
-      <w:r>
-        <w:t xml:space="preserve"> </w:t>
-      </w:r>
-      <w:proofErr w:type="spellStart"/>
-      <w:r>
-        <w:t>Back</w:t>
-      </w:r>
-      <w:proofErr w:type="spellEnd"/>
-      <w:r>
-        <w:t xml:space="preserve">” que leva de volta para o menu principal. </w:t>
+        <w:t xml:space="preserve">Comecei a criar a cena para o menu de definições com um slider para o volume e com um botão a dizer “Go Back” que leva de volta para o menu principal. </w:t>
       </w:r>
     </w:p>
     <w:p>
@@ -2278,39 +2082,7 @@
     </w:p>
     <w:p>
       <w:r>
-        <w:t>Adicionei também a função “</w:t>
-      </w:r>
-      <w:proofErr w:type="spellStart"/>
-      <w:r>
-        <w:t>SetMusicVolume</w:t>
-      </w:r>
-      <w:proofErr w:type="spellEnd"/>
-      <w:r>
-        <w:t xml:space="preserve">” ao script </w:t>
-      </w:r>
-      <w:proofErr w:type="spellStart"/>
-      <w:r>
-        <w:t>Conductor.cs</w:t>
-      </w:r>
-      <w:proofErr w:type="spellEnd"/>
-      <w:r>
-        <w:t xml:space="preserve"> que vai servir para controlar o volume do </w:t>
-      </w:r>
-      <w:proofErr w:type="spellStart"/>
-      <w:r>
-        <w:t>audiosource</w:t>
-      </w:r>
-      <w:proofErr w:type="spellEnd"/>
-      <w:r>
-        <w:t xml:space="preserve"> que está associado ao script, neste caso a música que o jogador estiver a jogar no momento. Usei o Mathf.Clamp01 para o limite ser de 0 a 1 que depois vai ser traduzido para 0% - 100%. O </w:t>
-      </w:r>
-      <w:proofErr w:type="spellStart"/>
-      <w:r>
-        <w:t>PlayerFrefs</w:t>
-      </w:r>
-      <w:proofErr w:type="spellEnd"/>
-      <w:r>
-        <w:t xml:space="preserve"> é usado para guardas as preferências o jogador mesmo depois de fechar e voltar a abrir o jogo, não havendo a necessidade de voltar a mudar o volume.</w:t>
+        <w:t>Adicionei também a função “SetMusicVolume” ao script Conductor.cs que vai servir para controlar o volume do audiosource que está associado ao script, neste caso a música que o jogador estiver a jogar no momento. Usei o Mathf.Clamp01 para o limite ser de 0 a 1 que depois vai ser traduzido para 0% - 100%. O PlayerFrefs é usado para guardas as preferências o jogador mesmo depois de fechar e voltar a abrir o jogo, não havendo a necessidade de voltar a mudar o volume.</w:t>
       </w:r>
     </w:p>
     <w:p>
@@ -2368,55 +2140,7 @@
     </w:p>
     <w:p>
       <w:r>
-        <w:t xml:space="preserve">Acabei as definições de volume na cena </w:t>
-      </w:r>
-      <w:proofErr w:type="spellStart"/>
-      <w:r>
-        <w:t>Settings</w:t>
-      </w:r>
-      <w:proofErr w:type="spellEnd"/>
-      <w:r>
-        <w:t xml:space="preserve"> e criei o script </w:t>
-      </w:r>
-      <w:proofErr w:type="spellStart"/>
-      <w:r>
-        <w:t>SettingsMenu.cs</w:t>
-      </w:r>
-      <w:proofErr w:type="spellEnd"/>
-      <w:r>
-        <w:t xml:space="preserve"> que faz a alteração do </w:t>
-      </w:r>
-      <w:proofErr w:type="spellStart"/>
-      <w:r>
-        <w:t>slider</w:t>
-      </w:r>
-      <w:proofErr w:type="spellEnd"/>
-      <w:r>
-        <w:t xml:space="preserve"> do volume e atribui o valor do </w:t>
-      </w:r>
-      <w:proofErr w:type="spellStart"/>
-      <w:r>
-        <w:t>slider</w:t>
-      </w:r>
-      <w:proofErr w:type="spellEnd"/>
-      <w:r>
-        <w:t xml:space="preserve"> aos </w:t>
-      </w:r>
-      <w:proofErr w:type="spellStart"/>
-      <w:r>
-        <w:t>PlayerPrefs</w:t>
-      </w:r>
-      <w:proofErr w:type="spellEnd"/>
-      <w:r>
-        <w:t xml:space="preserve"> para ficar guardado mesmo depois de mudar de cena ou mesmo de sair do jogo. Adicionei também um botão para voltar ao menu principal na cena de escolha do </w:t>
-      </w:r>
-      <w:proofErr w:type="spellStart"/>
-      <w:r>
-        <w:t>Beatmap</w:t>
-      </w:r>
-      <w:proofErr w:type="spellEnd"/>
-      <w:r>
-        <w:t>.</w:t>
+        <w:t>Acabei as definições de volume na cena Settings e criei o script SettingsMenu.cs que faz a alteração do slider do volume e atribui o valor do slider aos PlayerPrefs para ficar guardado mesmo depois de mudar de cena ou mesmo de sair do jogo. Adicionei também um botão para voltar ao menu principal na cena de escolha do Beatmap.</w:t>
       </w:r>
     </w:p>
     <w:p>
@@ -2424,6 +2148,9 @@
         <w:keepNext/>
       </w:pPr>
       <w:r>
+        <w:rPr>
+          <w:noProof/>
+        </w:rPr>
         <w:drawing>
           <wp:inline distT="0" distB="0" distL="0" distR="0" wp14:anchorId="30F66925" wp14:editId="2AAB6779">
             <wp:extent cx="6120130" cy="2865755"/>
@@ -2477,16 +2204,153 @@
         </w:r>
       </w:fldSimple>
       <w:r>
-        <w:t xml:space="preserve"> Escolha do </w:t>
-      </w:r>
-      <w:proofErr w:type="spellStart"/>
-      <w:r>
-        <w:t>Beatmap</w:t>
-      </w:r>
-      <w:proofErr w:type="spellEnd"/>
+        <w:t xml:space="preserve"> Escolha do Beatmap</w:t>
+      </w:r>
     </w:p>
     <w:p/>
-    <w:p/>
+    <w:p>
+      <w:r>
+        <w:t>19/10/2026</w:t>
+      </w:r>
+    </w:p>
+    <w:p>
+      <w:r>
+        <w:t>Comecei a configurar um editor de beatmaps dentro jogo e a sua cena, com painéis, botões, textos, etc.</w:t>
+      </w:r>
+    </w:p>
+    <w:p>
+      <w:pPr>
+        <w:keepNext/>
+      </w:pPr>
+      <w:r>
+        <w:drawing>
+          <wp:inline distT="0" distB="0" distL="0" distR="0" wp14:anchorId="4276405B" wp14:editId="177630E5">
+            <wp:extent cx="5692140" cy="2856701"/>
+            <wp:effectExtent l="0" t="0" r="3810" b="1270"/>
+            <wp:docPr id="1635721025" name="Imagem 1"/>
+            <wp:cNvGraphicFramePr>
+              <a:graphicFrameLocks xmlns:a="http://schemas.openxmlformats.org/drawingml/2006/main" noChangeAspect="1"/>
+            </wp:cNvGraphicFramePr>
+            <a:graphic xmlns:a="http://schemas.openxmlformats.org/drawingml/2006/main">
+              <a:graphicData uri="http://schemas.openxmlformats.org/drawingml/2006/picture">
+                <pic:pic xmlns:pic="http://schemas.openxmlformats.org/drawingml/2006/picture">
+                  <pic:nvPicPr>
+                    <pic:cNvPr id="1635721025" name=""/>
+                    <pic:cNvPicPr/>
+                  </pic:nvPicPr>
+                  <pic:blipFill>
+                    <a:blip r:embed="rId21"/>
+                    <a:stretch>
+                      <a:fillRect/>
+                    </a:stretch>
+                  </pic:blipFill>
+                  <pic:spPr>
+                    <a:xfrm>
+                      <a:off x="0" y="0"/>
+                      <a:ext cx="5701752" cy="2861525"/>
+                    </a:xfrm>
+                    <a:prstGeom prst="rect">
+                      <a:avLst/>
+                    </a:prstGeom>
+                  </pic:spPr>
+                </pic:pic>
+              </a:graphicData>
+            </a:graphic>
+          </wp:inline>
+        </w:drawing>
+      </w:r>
+    </w:p>
+    <w:p>
+      <w:pPr>
+        <w:pStyle w:val="Legenda"/>
+      </w:pPr>
+      <w:r>
+        <w:t xml:space="preserve">Figura </w:t>
+      </w:r>
+      <w:fldSimple w:instr=" SEQ Figura \* ARABIC ">
+        <w:r>
+          <w:rPr>
+            <w:noProof/>
+          </w:rPr>
+          <w:t>5</w:t>
+        </w:r>
+      </w:fldSimple>
+      <w:r>
+        <w:t xml:space="preserve"> Cena BeatmapEdit</w:t>
+      </w:r>
+    </w:p>
+    <w:p>
+      <w:r>
+        <w:lastRenderedPageBreak/>
+        <w:t>Depois de adicionar os elementos todos ao canvas estive a configurar as ancoras de cada elemento fazendo então este menu.</w:t>
+      </w:r>
+    </w:p>
+    <w:p>
+      <w:pPr>
+        <w:keepNext/>
+      </w:pPr>
+      <w:r>
+        <w:drawing>
+          <wp:inline distT="0" distB="0" distL="0" distR="0" wp14:anchorId="3EC0022C" wp14:editId="5B3774DA">
+            <wp:extent cx="6120130" cy="2975610"/>
+            <wp:effectExtent l="0" t="0" r="0" b="0"/>
+            <wp:docPr id="495259787" name="Imagem 1"/>
+            <wp:cNvGraphicFramePr>
+              <a:graphicFrameLocks xmlns:a="http://schemas.openxmlformats.org/drawingml/2006/main" noChangeAspect="1"/>
+            </wp:cNvGraphicFramePr>
+            <a:graphic xmlns:a="http://schemas.openxmlformats.org/drawingml/2006/main">
+              <a:graphicData uri="http://schemas.openxmlformats.org/drawingml/2006/picture">
+                <pic:pic xmlns:pic="http://schemas.openxmlformats.org/drawingml/2006/picture">
+                  <pic:nvPicPr>
+                    <pic:cNvPr id="495259787" name=""/>
+                    <pic:cNvPicPr/>
+                  </pic:nvPicPr>
+                  <pic:blipFill>
+                    <a:blip r:embed="rId22"/>
+                    <a:stretch>
+                      <a:fillRect/>
+                    </a:stretch>
+                  </pic:blipFill>
+                  <pic:spPr>
+                    <a:xfrm>
+                      <a:off x="0" y="0"/>
+                      <a:ext cx="6120130" cy="2975610"/>
+                    </a:xfrm>
+                    <a:prstGeom prst="rect">
+                      <a:avLst/>
+                    </a:prstGeom>
+                  </pic:spPr>
+                </pic:pic>
+              </a:graphicData>
+            </a:graphic>
+          </wp:inline>
+        </w:drawing>
+      </w:r>
+    </w:p>
+    <w:p>
+      <w:pPr>
+        <w:pStyle w:val="Legenda"/>
+      </w:pPr>
+      <w:r>
+        <w:t xml:space="preserve">Figura </w:t>
+      </w:r>
+      <w:fldSimple w:instr=" SEQ Figura \* ARABIC ">
+        <w:r>
+          <w:rPr>
+            <w:noProof/>
+          </w:rPr>
+          <w:t>6</w:t>
+        </w:r>
+      </w:fldSimple>
+      <w:r>
+        <w:t xml:space="preserve"> Cena BeatmapEdit</w:t>
+      </w:r>
+    </w:p>
+    <w:p>
+      <w:r>
+        <w:t>Adicionei também um script para os beatmaps começarem a aparecer sozinhos em lista num dropdown e aparecer os detahes de cada beatmap.</w:t>
+      </w:r>
+    </w:p>
     <w:p/>
     <w:p/>
     <w:p>
@@ -2537,7 +2401,6 @@
         </w:numPr>
       </w:pPr>
       <w:r>
-        <w:lastRenderedPageBreak/>
         <w:t>justificar devidamente as opções tomadas no decurso do projeto, apresentando, quando tal for relevante, as várias opções que estavam disponíveis, aquela que foi selecionada e os critérios que presidiram a essa escolha;</w:t>
       </w:r>
     </w:p>
@@ -2550,6 +2413,7 @@
         </w:numPr>
       </w:pPr>
       <w:r>
+        <w:lastRenderedPageBreak/>
         <w:t>recorrer a documentação técnica e a abstrações para apresentar e documentar a solução desenvolvida e a sua arquitetura</w:t>
       </w:r>
       <w:r>
@@ -2940,19 +2804,11 @@
       <w:r>
         <w:t xml:space="preserve">uando forem 3 ou mais, indicar o nome do primeiro, seguido da expressão </w:t>
       </w:r>
-      <w:proofErr w:type="spellStart"/>
       <w:r>
         <w:rPr>
           <w:i/>
         </w:rPr>
-        <w:t>et</w:t>
-      </w:r>
-      <w:proofErr w:type="spellEnd"/>
-      <w:r>
-        <w:rPr>
-          <w:i/>
-        </w:rPr>
-        <w:t xml:space="preserve"> al.</w:t>
+        <w:t>et al.</w:t>
       </w:r>
       <w:r>
         <w:t xml:space="preserve"> </w:t>
@@ -2977,21 +2833,12 @@
           <w:lang w:val="en-US"/>
         </w:rPr>
       </w:pPr>
-      <w:proofErr w:type="spellStart"/>
       <w:r>
         <w:rPr>
           <w:b/>
           <w:lang w:val="en-US"/>
         </w:rPr>
-        <w:t>Exemplo</w:t>
-      </w:r>
-      <w:proofErr w:type="spellEnd"/>
-      <w:r>
-        <w:rPr>
-          <w:b/>
-          <w:lang w:val="en-US"/>
-        </w:rPr>
-        <w:t xml:space="preserve"> 2:</w:t>
+        <w:t>Exemplo 2:</w:t>
       </w:r>
     </w:p>
     <w:p>
@@ -3047,7 +2894,7 @@
         </w:rPr>
         <w:t xml:space="preserve">Acedido em 31 de julho de 2012 através de </w:t>
       </w:r>
-      <w:hyperlink r:id="rId21" w:anchor="reader_1412975417" w:history="1">
+      <w:hyperlink r:id="rId23" w:anchor="reader_1412975417" w:history="1">
         <w:r>
           <w:rPr>
             <w:rStyle w:val="Hiperligao"/>
@@ -3153,13 +3000,8 @@
         <w:t>projeto</w:t>
       </w:r>
       <w:r>
-        <w:t xml:space="preserve"> em Project ou Open </w:t>
-      </w:r>
-      <w:proofErr w:type="spellStart"/>
-      <w:r>
-        <w:t>Proj</w:t>
-      </w:r>
-      <w:proofErr w:type="spellEnd"/>
+        <w:t xml:space="preserve"> em Project ou Open Proj</w:t>
+      </w:r>
     </w:p>
     <w:p>
       <w:r>
@@ -3329,10 +3171,10 @@
       </w:r>
     </w:p>
     <w:sectPr>
-      <w:headerReference w:type="default" r:id="rId22"/>
-      <w:footerReference w:type="default" r:id="rId23"/>
-      <w:headerReference w:type="first" r:id="rId24"/>
-      <w:footerReference w:type="first" r:id="rId25"/>
+      <w:headerReference w:type="default" r:id="rId24"/>
+      <w:footerReference w:type="default" r:id="rId25"/>
+      <w:headerReference w:type="first" r:id="rId26"/>
+      <w:footerReference w:type="first" r:id="rId27"/>
       <w:type w:val="continuous"/>
       <w:pgSz w:w="11906" w:h="16838"/>
       <w:pgMar w:top="1134" w:right="1134" w:bottom="1134" w:left="1134" w:header="709" w:footer="709" w:gutter="0"/>

</xml_diff>

<commit_message>
Persist beatmap metadata in editor
Save BPM and offset as JSON per song and difficulty, and reload them when switching beatmaps. Update the project report and remove its temporary Word lock file.
</commit_message>
<xml_diff>
--- a/Word e assim/Relatório SDJK - Gonçalo Andrade.docx
+++ b/Word e assim/Relatório SDJK - Gonçalo Andrade.docx
@@ -184,13 +184,29 @@
           <w:caps/>
           <w:color w:val="7F7F7F" w:themeColor="text1" w:themeTint="80"/>
         </w:rPr>
-        <w:t>NOME DO FORMANDO:</w:t>
+        <w:t xml:space="preserve">NOME DO </w:t>
+      </w:r>
+      <w:proofErr w:type="spellStart"/>
+      <w:r>
+        <w:rPr>
+          <w:b/>
+          <w:caps/>
+          <w:color w:val="7F7F7F" w:themeColor="text1" w:themeTint="80"/>
+        </w:rPr>
+        <w:t>FORMANDO:</w:t>
       </w:r>
       <w:r>
         <w:rPr>
           <w:sz w:val="12"/>
         </w:rPr>
-        <w:t>Gonçalo Andrade</w:t>
+        <w:t>Gonçalo</w:t>
+      </w:r>
+      <w:proofErr w:type="spellEnd"/>
+      <w:r>
+        <w:rPr>
+          <w:sz w:val="12"/>
+        </w:rPr>
+        <w:t xml:space="preserve"> Andrade</w:t>
       </w:r>
       <w:r>
         <w:rPr>
@@ -1382,12 +1398,68 @@
         <w:t>colunas</w:t>
       </w:r>
       <w:r>
-        <w:t xml:space="preserve"> onde descem bolas do topo da tela até ao fundo da tela e o jogador tem que acertar numa certa janela onde depois é julgado se acertou Perfect, Great, Good ou Miss. Tomei como inspiração os jogos “Quaver” e “Osu!Mania”, pois são do mesmo género e acho um conceito bastante interessante.</w:t>
-      </w:r>
-    </w:p>
-    <w:p>
-      <w:r>
-        <w:t>Foi desenvolvido em Unity 6, com a ajuda de alguns sites de outros criadores de jogos de ritmo e também com ajuda de ferramentas como Youtube, ChatGpt, GitHub e Manual do Unity.</w:t>
+        <w:t xml:space="preserve"> onde descem bolas do topo da tela até ao fundo da tela e o jogador tem que acertar numa certa janela onde depois é julgado se acertou </w:t>
+      </w:r>
+      <w:proofErr w:type="spellStart"/>
+      <w:r>
+        <w:t>Perfect</w:t>
+      </w:r>
+      <w:proofErr w:type="spellEnd"/>
+      <w:r>
+        <w:t xml:space="preserve">, Great, </w:t>
+      </w:r>
+      <w:proofErr w:type="spellStart"/>
+      <w:r>
+        <w:t>Good</w:t>
+      </w:r>
+      <w:proofErr w:type="spellEnd"/>
+      <w:r>
+        <w:t xml:space="preserve"> ou Miss. Tomei como inspiração os jogos “</w:t>
+      </w:r>
+      <w:proofErr w:type="spellStart"/>
+      <w:r>
+        <w:t>Quaver</w:t>
+      </w:r>
+      <w:proofErr w:type="spellEnd"/>
+      <w:r>
+        <w:t>” e “</w:t>
+      </w:r>
+      <w:proofErr w:type="spellStart"/>
+      <w:r>
+        <w:t>Osu!Mania</w:t>
+      </w:r>
+      <w:proofErr w:type="spellEnd"/>
+      <w:r>
+        <w:t>”, pois são do mesmo género e acho um conceito bastante interessante.</w:t>
+      </w:r>
+    </w:p>
+    <w:p>
+      <w:r>
+        <w:t xml:space="preserve">Foi desenvolvido em </w:t>
+      </w:r>
+      <w:proofErr w:type="spellStart"/>
+      <w:r>
+        <w:t>Unity</w:t>
+      </w:r>
+      <w:proofErr w:type="spellEnd"/>
+      <w:r>
+        <w:t xml:space="preserve"> 6, com a ajuda de alguns sites de outros criadores de jogos de ritmo e também com ajuda de ferramentas como Youtube, </w:t>
+      </w:r>
+      <w:proofErr w:type="spellStart"/>
+      <w:r>
+        <w:t>ChatGpt</w:t>
+      </w:r>
+      <w:proofErr w:type="spellEnd"/>
+      <w:r>
+        <w:t xml:space="preserve">, GitHub e Manual do </w:t>
+      </w:r>
+      <w:proofErr w:type="spellStart"/>
+      <w:r>
+        <w:t>Unity</w:t>
+      </w:r>
+      <w:proofErr w:type="spellEnd"/>
+      <w:r>
+        <w:t>.</w:t>
       </w:r>
     </w:p>
     <w:p>
@@ -1462,11 +1534,24 @@
       <w:bookmarkEnd w:id="4"/>
     </w:p>
     <w:p>
-      <w:r>
-        <w:t>Unity 6000.6.4f1</w:t>
-      </w:r>
-      <w:r>
-        <w:t xml:space="preserve"> – Desenvolvimento do jogo, dos assets e do HUD</w:t>
+      <w:proofErr w:type="spellStart"/>
+      <w:r>
+        <w:t>Unity</w:t>
+      </w:r>
+      <w:proofErr w:type="spellEnd"/>
+      <w:r>
+        <w:t xml:space="preserve"> 6000.6.4f1</w:t>
+      </w:r>
+      <w:r>
+        <w:t xml:space="preserve"> – Desenvolvimento do jogo, dos </w:t>
+      </w:r>
+      <w:proofErr w:type="spellStart"/>
+      <w:r>
+        <w:t>assets</w:t>
+      </w:r>
+      <w:proofErr w:type="spellEnd"/>
+      <w:r>
+        <w:t xml:space="preserve"> e do HUD</w:t>
       </w:r>
     </w:p>
     <w:p>
@@ -1526,7 +1611,23 @@
     </w:p>
     <w:p>
       <w:r>
-        <w:t>Visual Studio Code – Desenvolvimento dos scripts do jogo</w:t>
+        <w:t xml:space="preserve">Visual </w:t>
+      </w:r>
+      <w:proofErr w:type="spellStart"/>
+      <w:r>
+        <w:t>Studio</w:t>
+      </w:r>
+      <w:proofErr w:type="spellEnd"/>
+      <w:r>
+        <w:t xml:space="preserve"> </w:t>
+      </w:r>
+      <w:proofErr w:type="spellStart"/>
+      <w:r>
+        <w:t>Code</w:t>
+      </w:r>
+      <w:proofErr w:type="spellEnd"/>
+      <w:r>
+        <w:t xml:space="preserve"> – Desenvolvimento dos scripts do jogo</w:t>
       </w:r>
     </w:p>
     <w:p>
@@ -1585,8 +1686,13 @@
       </w:r>
     </w:p>
     <w:p>
-      <w:r>
-        <w:t>ChatGPT 6 – Organização de ideias, pesquisa e correção de erros</w:t>
+      <w:proofErr w:type="spellStart"/>
+      <w:r>
+        <w:t>ChatGPT</w:t>
+      </w:r>
+      <w:proofErr w:type="spellEnd"/>
+      <w:r>
+        <w:t xml:space="preserve"> 6 – Organização de ideias, pesquisa e correção de erros</w:t>
       </w:r>
     </w:p>
     <w:p>
@@ -1706,8 +1812,21 @@
     </w:p>
     <w:p>
       <w:r>
-        <w:t>GitHub – Repositório do jogo, relatórios diários das alterações e releases para amigos testarem e darem debug</w:t>
-      </w:r>
+        <w:t xml:space="preserve">GitHub – Repositório do jogo, relatórios diários das alterações e </w:t>
+      </w:r>
+      <w:proofErr w:type="spellStart"/>
+      <w:r>
+        <w:t>releases</w:t>
+      </w:r>
+      <w:proofErr w:type="spellEnd"/>
+      <w:r>
+        <w:t xml:space="preserve"> para amigos testarem e darem </w:t>
+      </w:r>
+      <w:proofErr w:type="spellStart"/>
+      <w:r>
+        <w:t>debug</w:t>
+      </w:r>
+      <w:proofErr w:type="spellEnd"/>
     </w:p>
     <w:p>
       <w:r>
@@ -1855,7 +1974,31 @@
         <w:t>Comecei por pesquisar</w:t>
       </w:r>
       <w:r>
-        <w:t xml:space="preserve"> como fazer o sistema de BPM, jogos de ritmo são baseados num sistema de AudioSettings.dspTime, basicamente o que acontece é que este sistema usa os segundos da música no jogo para contar o tempo passado, assim sendo mais preciso e não perdendo ritmo no meio do jogo, sendo um ritmo constante. Depois de ter este sistema criado comecei então por adicionar o UI principal do jogo como a Pontuação, Combo, Precisão e as quatro colunas. Adicionei também o input do jogador com o novo input system do unity e fiz então os inputs SDJK que corresponde cada um a uma coluna.</w:t>
+        <w:t xml:space="preserve"> como fazer o sistema de BPM, jogos de ritmo são baseados num sistema de </w:t>
+      </w:r>
+      <w:proofErr w:type="spellStart"/>
+      <w:r>
+        <w:t>AudioSettings.dspTime</w:t>
+      </w:r>
+      <w:proofErr w:type="spellEnd"/>
+      <w:r>
+        <w:t xml:space="preserve">, basicamente o que acontece é que este sistema usa os segundos da música no jogo para contar o tempo passado, assim sendo mais preciso e não perdendo ritmo no meio do jogo, sendo um ritmo constante. Depois de ter este sistema criado comecei então por adicionar o UI principal do jogo como a Pontuação, Combo, Precisão e as quatro colunas. Adicionei também o input do jogador com o novo input </w:t>
+      </w:r>
+      <w:proofErr w:type="spellStart"/>
+      <w:r>
+        <w:t>system</w:t>
+      </w:r>
+      <w:proofErr w:type="spellEnd"/>
+      <w:r>
+        <w:t xml:space="preserve"> do </w:t>
+      </w:r>
+      <w:proofErr w:type="spellStart"/>
+      <w:r>
+        <w:t>unity</w:t>
+      </w:r>
+      <w:proofErr w:type="spellEnd"/>
+      <w:r>
+        <w:t xml:space="preserve"> e fiz então os inputs SDJK que corresponde cada um a uma coluna.</w:t>
       </w:r>
     </w:p>
     <w:p>
@@ -1937,7 +2080,31 @@
     </w:p>
     <w:p>
       <w:r>
-        <w:t>Adicionei também uma maneira de criar “Beatmaps”, que são os mapas do jogo, são criados em JSON com uma estrutura especifica para o jogo. Como se nota na imagem abaixo os JSON são criados com duas variáveis: noteBeat (o beat em que a nota aparece) e laneIndex (a coluna em que aparece de 0 a 3).</w:t>
+        <w:t>Adicionei também uma maneira de criar “</w:t>
+      </w:r>
+      <w:proofErr w:type="spellStart"/>
+      <w:r>
+        <w:t>Beatmaps</w:t>
+      </w:r>
+      <w:proofErr w:type="spellEnd"/>
+      <w:r>
+        <w:t xml:space="preserve">”, que são os mapas do jogo, são criados em JSON com uma estrutura especifica para o jogo. Como se nota na imagem abaixo os JSON são criados com duas variáveis: </w:t>
+      </w:r>
+      <w:proofErr w:type="spellStart"/>
+      <w:r>
+        <w:t>noteBeat</w:t>
+      </w:r>
+      <w:proofErr w:type="spellEnd"/>
+      <w:r>
+        <w:t xml:space="preserve"> (o beat em que a nota aparece) e </w:t>
+      </w:r>
+      <w:proofErr w:type="spellStart"/>
+      <w:r>
+        <w:t>laneIndex</w:t>
+      </w:r>
+      <w:proofErr w:type="spellEnd"/>
+      <w:r>
+        <w:t xml:space="preserve"> (a coluna em que aparece de 0 a 3).</w:t>
       </w:r>
     </w:p>
     <w:p>
@@ -2002,8 +2169,13 @@
         </w:r>
       </w:fldSimple>
       <w:r>
-        <w:t xml:space="preserve"> Estrutura do Beatmap</w:t>
-      </w:r>
+        <w:t xml:space="preserve"> Estrutura do </w:t>
+      </w:r>
+      <w:proofErr w:type="spellStart"/>
+      <w:r>
+        <w:t>Beatmap</w:t>
+      </w:r>
+      <w:proofErr w:type="spellEnd"/>
     </w:p>
     <w:p>
       <w:r>
@@ -2013,7 +2185,31 @@
     </w:p>
     <w:p>
       <w:r>
-        <w:t xml:space="preserve">Comecei a criar a cena para o menu de definições com um slider para o volume e com um botão a dizer “Go Back” que leva de volta para o menu principal. </w:t>
+        <w:t xml:space="preserve">Comecei a criar a cena para o menu de definições com um </w:t>
+      </w:r>
+      <w:proofErr w:type="spellStart"/>
+      <w:r>
+        <w:t>slider</w:t>
+      </w:r>
+      <w:proofErr w:type="spellEnd"/>
+      <w:r>
+        <w:t xml:space="preserve"> para o volume e com um botão a dizer “</w:t>
+      </w:r>
+      <w:proofErr w:type="spellStart"/>
+      <w:r>
+        <w:t>Go</w:t>
+      </w:r>
+      <w:proofErr w:type="spellEnd"/>
+      <w:r>
+        <w:t xml:space="preserve"> </w:t>
+      </w:r>
+      <w:proofErr w:type="spellStart"/>
+      <w:r>
+        <w:t>Back</w:t>
+      </w:r>
+      <w:proofErr w:type="spellEnd"/>
+      <w:r>
+        <w:t xml:space="preserve">” que leva de volta para o menu principal. </w:t>
       </w:r>
     </w:p>
     <w:p>
@@ -2082,7 +2278,39 @@
     </w:p>
     <w:p>
       <w:r>
-        <w:t>Adicionei também a função “SetMusicVolume” ao script Conductor.cs que vai servir para controlar o volume do audiosource que está associado ao script, neste caso a música que o jogador estiver a jogar no momento. Usei o Mathf.Clamp01 para o limite ser de 0 a 1 que depois vai ser traduzido para 0% - 100%. O PlayerFrefs é usado para guardas as preferências o jogador mesmo depois de fechar e voltar a abrir o jogo, não havendo a necessidade de voltar a mudar o volume.</w:t>
+        <w:t>Adicionei também a função “</w:t>
+      </w:r>
+      <w:proofErr w:type="spellStart"/>
+      <w:r>
+        <w:t>SetMusicVolume</w:t>
+      </w:r>
+      <w:proofErr w:type="spellEnd"/>
+      <w:r>
+        <w:t xml:space="preserve">” ao script </w:t>
+      </w:r>
+      <w:proofErr w:type="spellStart"/>
+      <w:r>
+        <w:t>Conductor.cs</w:t>
+      </w:r>
+      <w:proofErr w:type="spellEnd"/>
+      <w:r>
+        <w:t xml:space="preserve"> que vai servir para controlar o volume do </w:t>
+      </w:r>
+      <w:proofErr w:type="spellStart"/>
+      <w:r>
+        <w:t>audiosource</w:t>
+      </w:r>
+      <w:proofErr w:type="spellEnd"/>
+      <w:r>
+        <w:t xml:space="preserve"> que está associado ao script, neste caso a música que o jogador estiver a jogar no momento. Usei o Mathf.Clamp01 para o limite ser de 0 a 1 que depois vai ser traduzido para 0% - 100%. O </w:t>
+      </w:r>
+      <w:proofErr w:type="spellStart"/>
+      <w:r>
+        <w:t>PlayerFrefs</w:t>
+      </w:r>
+      <w:proofErr w:type="spellEnd"/>
+      <w:r>
+        <w:t xml:space="preserve"> é usado para guardas as preferências o jogador mesmo depois de fechar e voltar a abrir o jogo, não havendo a necessidade de voltar a mudar o volume.</w:t>
       </w:r>
     </w:p>
     <w:p>
@@ -2140,7 +2368,55 @@
     </w:p>
     <w:p>
       <w:r>
-        <w:t>Acabei as definições de volume na cena Settings e criei o script SettingsMenu.cs que faz a alteração do slider do volume e atribui o valor do slider aos PlayerPrefs para ficar guardado mesmo depois de mudar de cena ou mesmo de sair do jogo. Adicionei também um botão para voltar ao menu principal na cena de escolha do Beatmap.</w:t>
+        <w:t xml:space="preserve">Acabei as definições de volume na cena </w:t>
+      </w:r>
+      <w:proofErr w:type="spellStart"/>
+      <w:r>
+        <w:t>Settings</w:t>
+      </w:r>
+      <w:proofErr w:type="spellEnd"/>
+      <w:r>
+        <w:t xml:space="preserve"> e criei o script </w:t>
+      </w:r>
+      <w:proofErr w:type="spellStart"/>
+      <w:r>
+        <w:t>SettingsMenu.cs</w:t>
+      </w:r>
+      <w:proofErr w:type="spellEnd"/>
+      <w:r>
+        <w:t xml:space="preserve"> que faz a alteração do </w:t>
+      </w:r>
+      <w:proofErr w:type="spellStart"/>
+      <w:r>
+        <w:t>slider</w:t>
+      </w:r>
+      <w:proofErr w:type="spellEnd"/>
+      <w:r>
+        <w:t xml:space="preserve"> do volume e atribui o valor do </w:t>
+      </w:r>
+      <w:proofErr w:type="spellStart"/>
+      <w:r>
+        <w:t>slider</w:t>
+      </w:r>
+      <w:proofErr w:type="spellEnd"/>
+      <w:r>
+        <w:t xml:space="preserve"> aos </w:t>
+      </w:r>
+      <w:proofErr w:type="spellStart"/>
+      <w:r>
+        <w:t>PlayerPrefs</w:t>
+      </w:r>
+      <w:proofErr w:type="spellEnd"/>
+      <w:r>
+        <w:t xml:space="preserve"> para ficar guardado mesmo depois de mudar de cena ou mesmo de sair do jogo. Adicionei também um botão para voltar ao menu principal na cena de escolha do </w:t>
+      </w:r>
+      <w:proofErr w:type="spellStart"/>
+      <w:r>
+        <w:t>Beatmap</w:t>
+      </w:r>
+      <w:proofErr w:type="spellEnd"/>
+      <w:r>
+        <w:t>.</w:t>
       </w:r>
     </w:p>
     <w:p>
@@ -2204,8 +2480,13 @@
         </w:r>
       </w:fldSimple>
       <w:r>
-        <w:t xml:space="preserve"> Escolha do Beatmap</w:t>
-      </w:r>
+        <w:t xml:space="preserve"> Escolha do </w:t>
+      </w:r>
+      <w:proofErr w:type="spellStart"/>
+      <w:r>
+        <w:t>Beatmap</w:t>
+      </w:r>
+      <w:proofErr w:type="spellEnd"/>
     </w:p>
     <w:p/>
     <w:p>
@@ -2215,7 +2496,15 @@
     </w:p>
     <w:p>
       <w:r>
-        <w:t>Comecei a configurar um editor de beatmaps dentro jogo e a sua cena, com painéis, botões, textos, etc.</w:t>
+        <w:t xml:space="preserve">Comecei a configurar um editor de </w:t>
+      </w:r>
+      <w:proofErr w:type="spellStart"/>
+      <w:r>
+        <w:t>beatmaps</w:t>
+      </w:r>
+      <w:proofErr w:type="spellEnd"/>
+      <w:r>
+        <w:t xml:space="preserve"> dentro jogo e a sua cena, com painéis, botões, textos, etc.</w:t>
       </w:r>
     </w:p>
     <w:p>
@@ -2223,6 +2512,9 @@
         <w:keepNext/>
       </w:pPr>
       <w:r>
+        <w:rPr>
+          <w:noProof/>
+        </w:rPr>
         <w:drawing>
           <wp:inline distT="0" distB="0" distL="0" distR="0" wp14:anchorId="4276405B" wp14:editId="177630E5">
             <wp:extent cx="5692140" cy="2856701"/>
@@ -2276,13 +2568,26 @@
         </w:r>
       </w:fldSimple>
       <w:r>
-        <w:t xml:space="preserve"> Cena BeatmapEdit</w:t>
-      </w:r>
+        <w:t xml:space="preserve"> Cena </w:t>
+      </w:r>
+      <w:proofErr w:type="spellStart"/>
+      <w:r>
+        <w:t>BeatmapEdit</w:t>
+      </w:r>
+      <w:proofErr w:type="spellEnd"/>
     </w:p>
     <w:p>
       <w:r>
         <w:lastRenderedPageBreak/>
-        <w:t>Depois de adicionar os elementos todos ao canvas estive a configurar as ancoras de cada elemento fazendo então este menu.</w:t>
+        <w:t xml:space="preserve">Depois de adicionar os elementos todos ao </w:t>
+      </w:r>
+      <w:proofErr w:type="spellStart"/>
+      <w:r>
+        <w:t>canvas</w:t>
+      </w:r>
+      <w:proofErr w:type="spellEnd"/>
+      <w:r>
+        <w:t xml:space="preserve"> estive a configurar as ancoras de cada elemento fazendo então este menu.</w:t>
       </w:r>
     </w:p>
     <w:p>
@@ -2290,6 +2595,9 @@
         <w:keepNext/>
       </w:pPr>
       <w:r>
+        <w:rPr>
+          <w:noProof/>
+        </w:rPr>
         <w:drawing>
           <wp:inline distT="0" distB="0" distL="0" distR="0" wp14:anchorId="3EC0022C" wp14:editId="5B3774DA">
             <wp:extent cx="6120130" cy="2975610"/>
@@ -2343,16 +2651,437 @@
         </w:r>
       </w:fldSimple>
       <w:r>
-        <w:t xml:space="preserve"> Cena BeatmapEdit</w:t>
-      </w:r>
-    </w:p>
-    <w:p>
-      <w:r>
-        <w:t>Adicionei também um script para os beatmaps começarem a aparecer sozinhos em lista num dropdown e aparecer os detahes de cada beatmap.</w:t>
-      </w:r>
+        <w:t xml:space="preserve"> Cena </w:t>
+      </w:r>
+      <w:proofErr w:type="spellStart"/>
+      <w:r>
+        <w:t>BeatmapEdit</w:t>
+      </w:r>
+      <w:proofErr w:type="spellEnd"/>
+    </w:p>
+    <w:p>
+      <w:r>
+        <w:t xml:space="preserve">Adicionei também um script para os </w:t>
+      </w:r>
+      <w:proofErr w:type="spellStart"/>
+      <w:r>
+        <w:t>beatmaps</w:t>
+      </w:r>
+      <w:proofErr w:type="spellEnd"/>
+      <w:r>
+        <w:t xml:space="preserve"> começarem a aparecer sozinhos em lista num </w:t>
+      </w:r>
+      <w:proofErr w:type="spellStart"/>
+      <w:r>
+        <w:t>dropdown</w:t>
+      </w:r>
+      <w:proofErr w:type="spellEnd"/>
+      <w:r>
+        <w:t xml:space="preserve"> e aparecer os </w:t>
+      </w:r>
+      <w:proofErr w:type="spellStart"/>
+      <w:r>
+        <w:t>detahes</w:t>
+      </w:r>
+      <w:proofErr w:type="spellEnd"/>
+      <w:r>
+        <w:t xml:space="preserve"> de cada </w:t>
+      </w:r>
+      <w:proofErr w:type="spellStart"/>
+      <w:r>
+        <w:t>beatmap</w:t>
+      </w:r>
+      <w:proofErr w:type="spellEnd"/>
+      <w:r>
+        <w:t>.</w:t>
+      </w:r>
+    </w:p>
+    <w:p/>
+    <w:p>
+      <w:r>
+        <w:t>20/10/2026</w:t>
+      </w:r>
+    </w:p>
+    <w:p>
+      <w:r>
+        <w:t xml:space="preserve">O jogador agora consegue alterar o BPM e o Offset do </w:t>
+      </w:r>
+      <w:proofErr w:type="spellStart"/>
+      <w:r>
+        <w:t>beatmap</w:t>
+      </w:r>
+      <w:proofErr w:type="spellEnd"/>
+      <w:r>
+        <w:t xml:space="preserve"> escolhido na cena </w:t>
+      </w:r>
+      <w:proofErr w:type="spellStart"/>
+      <w:r>
+        <w:t>BeatmapEdit</w:t>
+      </w:r>
+      <w:proofErr w:type="spellEnd"/>
+      <w:r>
+        <w:t>, mas, ainda não consegue aplicar essas definições porque a conexão do script ao botão “Save” ainda não está feita.</w:t>
+      </w:r>
+    </w:p>
+    <w:p>
+      <w:pPr>
+        <w:keepNext/>
+      </w:pPr>
+      <w:r>
+        <w:rPr>
+          <w:noProof/>
+        </w:rPr>
+        <w:lastRenderedPageBreak/>
+        <w:drawing>
+          <wp:inline distT="0" distB="0" distL="0" distR="0" wp14:anchorId="68C176BD" wp14:editId="3E212BBB">
+            <wp:extent cx="5867400" cy="4569238"/>
+            <wp:effectExtent l="0" t="0" r="0" b="3175"/>
+            <wp:docPr id="1409541116" name="Imagem 1"/>
+            <wp:cNvGraphicFramePr>
+              <a:graphicFrameLocks xmlns:a="http://schemas.openxmlformats.org/drawingml/2006/main" noChangeAspect="1"/>
+            </wp:cNvGraphicFramePr>
+            <a:graphic xmlns:a="http://schemas.openxmlformats.org/drawingml/2006/main">
+              <a:graphicData uri="http://schemas.openxmlformats.org/drawingml/2006/picture">
+                <pic:pic xmlns:pic="http://schemas.openxmlformats.org/drawingml/2006/picture">
+                  <pic:nvPicPr>
+                    <pic:cNvPr id="1409541116" name=""/>
+                    <pic:cNvPicPr/>
+                  </pic:nvPicPr>
+                  <pic:blipFill>
+                    <a:blip r:embed="rId23"/>
+                    <a:stretch>
+                      <a:fillRect/>
+                    </a:stretch>
+                  </pic:blipFill>
+                  <pic:spPr>
+                    <a:xfrm>
+                      <a:off x="0" y="0"/>
+                      <a:ext cx="5884083" cy="4582230"/>
+                    </a:xfrm>
+                    <a:prstGeom prst="rect">
+                      <a:avLst/>
+                    </a:prstGeom>
+                  </pic:spPr>
+                </pic:pic>
+              </a:graphicData>
+            </a:graphic>
+          </wp:inline>
+        </w:drawing>
+      </w:r>
+    </w:p>
+    <w:p>
+      <w:pPr>
+        <w:pStyle w:val="Legenda"/>
+      </w:pPr>
+      <w:r>
+        <w:t xml:space="preserve">Figura </w:t>
+      </w:r>
+      <w:fldSimple w:instr=" SEQ Figura \* ARABIC ">
+        <w:r>
+          <w:rPr>
+            <w:noProof/>
+          </w:rPr>
+          <w:t>7</w:t>
+        </w:r>
+      </w:fldSimple>
+      <w:r>
+        <w:t xml:space="preserve"> </w:t>
+      </w:r>
+      <w:proofErr w:type="spellStart"/>
+      <w:r>
+        <w:t>BeatmapEditorManager.cs</w:t>
+      </w:r>
+      <w:proofErr w:type="spellEnd"/>
+    </w:p>
+    <w:p>
+      <w:r>
+        <w:t xml:space="preserve">Aprendi também a usar o </w:t>
+      </w:r>
+      <w:proofErr w:type="spellStart"/>
+      <w:r>
+        <w:t>float.TryParse</w:t>
+      </w:r>
+      <w:proofErr w:type="spellEnd"/>
+      <w:r>
+        <w:t xml:space="preserve"> para fazer validação dos inputs do jogador como mostrado na imagem acima.</w:t>
+      </w:r>
+    </w:p>
+    <w:p/>
+    <w:p>
+      <w:r>
+        <w:t>23/10/2026</w:t>
+      </w:r>
+    </w:p>
+    <w:p>
+      <w:r>
+        <w:t>Fiz o botão “Save” funcionar na cena “</w:t>
+      </w:r>
+      <w:proofErr w:type="spellStart"/>
+      <w:r>
+        <w:t>BeatmapEdit</w:t>
+      </w:r>
+      <w:proofErr w:type="spellEnd"/>
+      <w:r>
+        <w:t xml:space="preserve">” criando uma função para salvar as alterações e depois traduzi-las para </w:t>
+      </w:r>
+      <w:proofErr w:type="spellStart"/>
+      <w:r>
+        <w:t>json</w:t>
+      </w:r>
+      <w:proofErr w:type="spellEnd"/>
+      <w:r>
+        <w:t xml:space="preserve"> e depois criando uma pasta para guardar esses ficheiros .</w:t>
+      </w:r>
+      <w:proofErr w:type="spellStart"/>
+      <w:r>
+        <w:t>json</w:t>
+      </w:r>
+      <w:proofErr w:type="spellEnd"/>
+      <w:r>
+        <w:t xml:space="preserve"> com as informações do </w:t>
+      </w:r>
+      <w:proofErr w:type="spellStart"/>
+      <w:r>
+        <w:t>beatmap</w:t>
+      </w:r>
+      <w:proofErr w:type="spellEnd"/>
+      <w:r>
+        <w:t>, sendo usadas quando o jogador voltar a abrir o jogo, assim não é necessário fazer alterações outra vez.</w:t>
+      </w:r>
+    </w:p>
+    <w:p>
+      <w:pPr>
+        <w:keepNext/>
+      </w:pPr>
+      <w:r>
+        <w:lastRenderedPageBreak/>
+        <w:drawing>
+          <wp:inline distT="0" distB="0" distL="0" distR="0" wp14:anchorId="21DEEFEB" wp14:editId="00A6DDEC">
+            <wp:extent cx="4922947" cy="4435224"/>
+            <wp:effectExtent l="0" t="0" r="0" b="3810"/>
+            <wp:docPr id="1894024245" name="Imagem 1"/>
+            <wp:cNvGraphicFramePr>
+              <a:graphicFrameLocks xmlns:a="http://schemas.openxmlformats.org/drawingml/2006/main" noChangeAspect="1"/>
+            </wp:cNvGraphicFramePr>
+            <a:graphic xmlns:a="http://schemas.openxmlformats.org/drawingml/2006/main">
+              <a:graphicData uri="http://schemas.openxmlformats.org/drawingml/2006/picture">
+                <pic:pic xmlns:pic="http://schemas.openxmlformats.org/drawingml/2006/picture">
+                  <pic:nvPicPr>
+                    <pic:cNvPr id="1894024245" name=""/>
+                    <pic:cNvPicPr/>
+                  </pic:nvPicPr>
+                  <pic:blipFill>
+                    <a:blip r:embed="rId24"/>
+                    <a:stretch>
+                      <a:fillRect/>
+                    </a:stretch>
+                  </pic:blipFill>
+                  <pic:spPr>
+                    <a:xfrm>
+                      <a:off x="0" y="0"/>
+                      <a:ext cx="4922947" cy="4435224"/>
+                    </a:xfrm>
+                    <a:prstGeom prst="rect">
+                      <a:avLst/>
+                    </a:prstGeom>
+                  </pic:spPr>
+                </pic:pic>
+              </a:graphicData>
+            </a:graphic>
+          </wp:inline>
+        </w:drawing>
+      </w:r>
+    </w:p>
+    <w:p>
+      <w:pPr>
+        <w:pStyle w:val="Legenda"/>
+      </w:pPr>
+      <w:r>
+        <w:t xml:space="preserve">Figura </w:t>
+      </w:r>
+      <w:fldSimple w:instr=" SEQ Figura \* ARABIC ">
+        <w:r>
+          <w:rPr>
+            <w:noProof/>
+          </w:rPr>
+          <w:t>8</w:t>
+        </w:r>
+      </w:fldSimple>
+      <w:r>
+        <w:t xml:space="preserve"> Função </w:t>
+      </w:r>
+      <w:proofErr w:type="spellStart"/>
+      <w:r>
+        <w:t>SaveBeatmap</w:t>
+      </w:r>
+      <w:proofErr w:type="spellEnd"/>
+    </w:p>
+    <w:p>
+      <w:r>
+        <w:t>Adicionei mais duas funções. Uma função para carregar os valores guardados no .</w:t>
+      </w:r>
+      <w:proofErr w:type="spellStart"/>
+      <w:r>
+        <w:t>json</w:t>
+      </w:r>
+      <w:proofErr w:type="spellEnd"/>
+      <w:r>
+        <w:t xml:space="preserve"> do </w:t>
+      </w:r>
+      <w:proofErr w:type="spellStart"/>
+      <w:r>
+        <w:t>beatmap</w:t>
+      </w:r>
+      <w:proofErr w:type="spellEnd"/>
+      <w:r>
+        <w:t xml:space="preserve"> para assim não ser preciso estar sempre a por os valores de volta quando se abre o jogo. E outra para não ter que estar sempre a procurar o caminho do .</w:t>
+      </w:r>
+      <w:proofErr w:type="spellStart"/>
+      <w:r>
+        <w:t>json</w:t>
+      </w:r>
+      <w:proofErr w:type="spellEnd"/>
+      <w:r>
+        <w:t xml:space="preserve"> sempre que crio uma função nova que precise do mesmo.</w:t>
+      </w:r>
+    </w:p>
+    <w:p>
+      <w:pPr>
+        <w:keepNext/>
+      </w:pPr>
+      <w:r>
+        <w:lastRenderedPageBreak/>
+        <w:drawing>
+          <wp:inline distT="0" distB="0" distL="0" distR="0" wp14:anchorId="4548B0BC" wp14:editId="496C06B8">
+            <wp:extent cx="6111240" cy="3888164"/>
+            <wp:effectExtent l="0" t="0" r="3810" b="0"/>
+            <wp:docPr id="2067074007" name="Imagem 1"/>
+            <wp:cNvGraphicFramePr>
+              <a:graphicFrameLocks xmlns:a="http://schemas.openxmlformats.org/drawingml/2006/main" noChangeAspect="1"/>
+            </wp:cNvGraphicFramePr>
+            <a:graphic xmlns:a="http://schemas.openxmlformats.org/drawingml/2006/main">
+              <a:graphicData uri="http://schemas.openxmlformats.org/drawingml/2006/picture">
+                <pic:pic xmlns:pic="http://schemas.openxmlformats.org/drawingml/2006/picture">
+                  <pic:nvPicPr>
+                    <pic:cNvPr id="2067074007" name=""/>
+                    <pic:cNvPicPr/>
+                  </pic:nvPicPr>
+                  <pic:blipFill>
+                    <a:blip r:embed="rId25"/>
+                    <a:stretch>
+                      <a:fillRect/>
+                    </a:stretch>
+                  </pic:blipFill>
+                  <pic:spPr>
+                    <a:xfrm>
+                      <a:off x="0" y="0"/>
+                      <a:ext cx="6124009" cy="3896288"/>
+                    </a:xfrm>
+                    <a:prstGeom prst="rect">
+                      <a:avLst/>
+                    </a:prstGeom>
+                  </pic:spPr>
+                </pic:pic>
+              </a:graphicData>
+            </a:graphic>
+          </wp:inline>
+        </w:drawing>
+      </w:r>
+    </w:p>
+    <w:p>
+      <w:pPr>
+        <w:pStyle w:val="Legenda"/>
+      </w:pPr>
+      <w:r>
+        <w:t xml:space="preserve">Figura </w:t>
+      </w:r>
+      <w:fldSimple w:instr=" SEQ Figura \* ARABIC ">
+        <w:r>
+          <w:rPr>
+            <w:noProof/>
+          </w:rPr>
+          <w:t>9</w:t>
+        </w:r>
+      </w:fldSimple>
+      <w:r>
+        <w:t xml:space="preserve"> Função </w:t>
+      </w:r>
+      <w:proofErr w:type="spellStart"/>
+      <w:r>
+        <w:t>LoadBeatmapMetadata</w:t>
+      </w:r>
+      <w:proofErr w:type="spellEnd"/>
+    </w:p>
+    <w:p>
+      <w:pPr>
+        <w:keepNext/>
+      </w:pPr>
+      <w:r>
+        <w:drawing>
+          <wp:inline distT="0" distB="0" distL="0" distR="0" wp14:anchorId="7B99E96E" wp14:editId="681B1DCE">
+            <wp:extent cx="6120130" cy="2024380"/>
+            <wp:effectExtent l="0" t="0" r="0" b="0"/>
+            <wp:docPr id="2107039534" name="Imagem 1"/>
+            <wp:cNvGraphicFramePr>
+              <a:graphicFrameLocks xmlns:a="http://schemas.openxmlformats.org/drawingml/2006/main" noChangeAspect="1"/>
+            </wp:cNvGraphicFramePr>
+            <a:graphic xmlns:a="http://schemas.openxmlformats.org/drawingml/2006/main">
+              <a:graphicData uri="http://schemas.openxmlformats.org/drawingml/2006/picture">
+                <pic:pic xmlns:pic="http://schemas.openxmlformats.org/drawingml/2006/picture">
+                  <pic:nvPicPr>
+                    <pic:cNvPr id="2107039534" name=""/>
+                    <pic:cNvPicPr/>
+                  </pic:nvPicPr>
+                  <pic:blipFill>
+                    <a:blip r:embed="rId26"/>
+                    <a:stretch>
+                      <a:fillRect/>
+                    </a:stretch>
+                  </pic:blipFill>
+                  <pic:spPr>
+                    <a:xfrm>
+                      <a:off x="0" y="0"/>
+                      <a:ext cx="6120130" cy="2024380"/>
+                    </a:xfrm>
+                    <a:prstGeom prst="rect">
+                      <a:avLst/>
+                    </a:prstGeom>
+                  </pic:spPr>
+                </pic:pic>
+              </a:graphicData>
+            </a:graphic>
+          </wp:inline>
+        </w:drawing>
+      </w:r>
+    </w:p>
+    <w:p>
+      <w:pPr>
+        <w:pStyle w:val="Legenda"/>
+      </w:pPr>
+      <w:r>
+        <w:t xml:space="preserve">Figura </w:t>
+      </w:r>
+      <w:fldSimple w:instr=" SEQ Figura \* ARABIC ">
+        <w:r>
+          <w:rPr>
+            <w:noProof/>
+          </w:rPr>
+          <w:t>10</w:t>
+        </w:r>
+      </w:fldSimple>
+      <w:r>
+        <w:t xml:space="preserve"> Função </w:t>
+      </w:r>
+      <w:proofErr w:type="spellStart"/>
+      <w:r>
+        <w:t>GetMetadataFilePath</w:t>
+      </w:r>
+      <w:proofErr w:type="spellEnd"/>
     </w:p>
     <w:p/>
     <w:p/>
+    <w:p/>
+    <w:p/>
     <w:p>
       <w:r>
         <w:t>O desenvolvimento é o "grosso" do trabalho de relatório e deve explicar de forma organizada, o caminho percorrido, as reflexões sobre os problemas levantados e as justificações das posições tomadas. Pode ser dividido em subtemas ou em capítulos com títulos e subtítulos.</w:t>
@@ -2360,6 +3089,7 @@
     </w:p>
     <w:p>
       <w:r>
+        <w:lastRenderedPageBreak/>
         <w:t>Num relatório de projeto, as questões ligadas à conceção de uma solução assumem grande importância, sendo trabalhos onde, em geral, há um</w:t>
       </w:r>
       <w:r>
@@ -2413,7 +3143,6 @@
         </w:numPr>
       </w:pPr>
       <w:r>
-        <w:lastRenderedPageBreak/>
         <w:t>recorrer a documentação técnica e a abstrações para apresentar e documentar a solução desenvolvida e a sua arquitetura</w:t>
       </w:r>
       <w:r>
@@ -2804,11 +3533,19 @@
       <w:r>
         <w:t xml:space="preserve">uando forem 3 ou mais, indicar o nome do primeiro, seguido da expressão </w:t>
       </w:r>
+      <w:proofErr w:type="spellStart"/>
       <w:r>
         <w:rPr>
           <w:i/>
         </w:rPr>
-        <w:t>et al.</w:t>
+        <w:t>et</w:t>
+      </w:r>
+      <w:proofErr w:type="spellEnd"/>
+      <w:r>
+        <w:rPr>
+          <w:i/>
+        </w:rPr>
+        <w:t xml:space="preserve"> al.</w:t>
       </w:r>
       <w:r>
         <w:t xml:space="preserve"> </w:t>
@@ -2833,12 +3570,21 @@
           <w:lang w:val="en-US"/>
         </w:rPr>
       </w:pPr>
+      <w:proofErr w:type="spellStart"/>
       <w:r>
         <w:rPr>
           <w:b/>
           <w:lang w:val="en-US"/>
         </w:rPr>
-        <w:t>Exemplo 2:</w:t>
+        <w:t>Exemplo</w:t>
+      </w:r>
+      <w:proofErr w:type="spellEnd"/>
+      <w:r>
+        <w:rPr>
+          <w:b/>
+          <w:lang w:val="en-US"/>
+        </w:rPr>
+        <w:t xml:space="preserve"> 2:</w:t>
       </w:r>
     </w:p>
     <w:p>
@@ -2894,7 +3640,7 @@
         </w:rPr>
         <w:t xml:space="preserve">Acedido em 31 de julho de 2012 através de </w:t>
       </w:r>
-      <w:hyperlink r:id="rId23" w:anchor="reader_1412975417" w:history="1">
+      <w:hyperlink r:id="rId27" w:anchor="reader_1412975417" w:history="1">
         <w:r>
           <w:rPr>
             <w:rStyle w:val="Hiperligao"/>
@@ -3000,8 +3746,13 @@
         <w:t>projeto</w:t>
       </w:r>
       <w:r>
-        <w:t xml:space="preserve"> em Project ou Open Proj</w:t>
-      </w:r>
+        <w:t xml:space="preserve"> em Project ou Open </w:t>
+      </w:r>
+      <w:proofErr w:type="spellStart"/>
+      <w:r>
+        <w:t>Proj</w:t>
+      </w:r>
+      <w:proofErr w:type="spellEnd"/>
     </w:p>
     <w:p>
       <w:r>
@@ -3171,10 +3922,10 @@
       </w:r>
     </w:p>
     <w:sectPr>
-      <w:headerReference w:type="default" r:id="rId24"/>
-      <w:footerReference w:type="default" r:id="rId25"/>
-      <w:headerReference w:type="first" r:id="rId26"/>
-      <w:footerReference w:type="first" r:id="rId27"/>
+      <w:headerReference w:type="default" r:id="rId28"/>
+      <w:footerReference w:type="default" r:id="rId29"/>
+      <w:headerReference w:type="first" r:id="rId30"/>
+      <w:footerReference w:type="first" r:id="rId31"/>
       <w:type w:val="continuous"/>
       <w:pgSz w:w="11906" w:h="16838"/>
       <w:pgMar w:top="1134" w:right="1134" w:bottom="1134" w:left="1134" w:header="709" w:footer="709" w:gutter="0"/>

</xml_diff>

<commit_message>
Adjust judgment timing windows
Widen the grading thresholds, remove the stale music reference from the scene, and update the project report.
</commit_message>
<xml_diff>
--- a/Word e assim/Relatório SDJK - Gonçalo Andrade.docx
+++ b/Word e assim/Relatório SDJK - Gonçalo Andrade.docx
@@ -187,6 +187,7 @@
         <w:t xml:space="preserve">NOME DO </w:t>
       </w:r>
       <w:proofErr w:type="spellStart"/>
+      <w:proofErr w:type="gramStart"/>
       <w:r>
         <w:rPr>
           <w:b/>
@@ -202,6 +203,7 @@
         <w:t>Gonçalo</w:t>
       </w:r>
       <w:proofErr w:type="spellEnd"/>
+      <w:proofErr w:type="gramEnd"/>
       <w:r>
         <w:rPr>
           <w:sz w:val="12"/>
@@ -345,8 +347,8 @@
       </w:pPr>
     </w:p>
     <w:bookmarkStart w:id="0" w:name="_Toc416172910" w:displacedByCustomXml="next"/>
-    <w:bookmarkStart w:id="1" w:name="_Toc167262095" w:displacedByCustomXml="next"/>
-    <w:bookmarkStart w:id="2" w:name="_Toc416268416" w:displacedByCustomXml="next"/>
+    <w:bookmarkStart w:id="1" w:name="_Toc416268416" w:displacedByCustomXml="next"/>
+    <w:bookmarkStart w:id="2" w:name="_Toc167262095" w:displacedByCustomXml="next"/>
     <w:sdt>
       <w:sdtPr>
         <w:rPr>
@@ -1425,10 +1427,12 @@
         <w:t>” e “</w:t>
       </w:r>
       <w:proofErr w:type="spellStart"/>
+      <w:proofErr w:type="gramStart"/>
       <w:r>
         <w:t>Osu!Mania</w:t>
       </w:r>
       <w:proofErr w:type="spellEnd"/>
+      <w:proofErr w:type="gramEnd"/>
       <w:r>
         <w:t>”, pois são do mesmo género e acho um conceito bastante interessante.</w:t>
       </w:r>
@@ -2180,6 +2184,199 @@
     <w:p>
       <w:r>
         <w:lastRenderedPageBreak/>
+        <w:t>Por volta do terceiro dia criei o “</w:t>
+      </w:r>
+      <w:proofErr w:type="spellStart"/>
+      <w:r>
+        <w:t>Judgment</w:t>
+      </w:r>
+      <w:proofErr w:type="spellEnd"/>
+      <w:r>
+        <w:t>” do jogo que como o nome indica funciona como júri</w:t>
+      </w:r>
+      <w:r>
+        <w:t xml:space="preserve">. Este júri vai analisar os cliques do jogador nas teclas SDJK e associar um valor a esse clique, esses valores estão divididos em quatro juramentos: </w:t>
+      </w:r>
+      <w:proofErr w:type="spellStart"/>
+      <w:r>
+        <w:t>Perfect</w:t>
+      </w:r>
+      <w:proofErr w:type="spellEnd"/>
+      <w:r>
+        <w:t xml:space="preserve"> (300 pontos), Great (150 pontos), </w:t>
+      </w:r>
+      <w:proofErr w:type="spellStart"/>
+      <w:r>
+        <w:t>Good</w:t>
+      </w:r>
+      <w:proofErr w:type="spellEnd"/>
+      <w:r>
+        <w:t xml:space="preserve"> (50 pontos), Miss. São detetados pela diferença da posição atual da nota e da posição de clique que seria 0. Portanto se o jogador clicar quando essa diferença for 0.05 o júri vai associar a </w:t>
+      </w:r>
+      <w:proofErr w:type="spellStart"/>
+      <w:proofErr w:type="gramStart"/>
+      <w:r>
+        <w:t>Perfect</w:t>
+      </w:r>
+      <w:proofErr w:type="spellEnd"/>
+      <w:proofErr w:type="gramEnd"/>
+      <w:r>
+        <w:t xml:space="preserve"> mas caso clique entre 0.08 e 0.19 já é associado o Great.</w:t>
+      </w:r>
+      <w:r>
+        <w:t xml:space="preserve"> Usei também este juramento para fazer a precisão do jogador.</w:t>
+      </w:r>
+    </w:p>
+    <w:p>
+      <w:pPr>
+        <w:keepNext/>
+      </w:pPr>
+      <w:r>
+        <w:drawing>
+          <wp:inline distT="0" distB="0" distL="0" distR="0" wp14:anchorId="27ADC86A" wp14:editId="50EE44E0">
+            <wp:extent cx="3017782" cy="1181202"/>
+            <wp:effectExtent l="0" t="0" r="0" b="0"/>
+            <wp:docPr id="1073073363" name="Imagem 1"/>
+            <wp:cNvGraphicFramePr>
+              <a:graphicFrameLocks xmlns:a="http://schemas.openxmlformats.org/drawingml/2006/main" noChangeAspect="1"/>
+            </wp:cNvGraphicFramePr>
+            <a:graphic xmlns:a="http://schemas.openxmlformats.org/drawingml/2006/main">
+              <a:graphicData uri="http://schemas.openxmlformats.org/drawingml/2006/picture">
+                <pic:pic xmlns:pic="http://schemas.openxmlformats.org/drawingml/2006/picture">
+                  <pic:nvPicPr>
+                    <pic:cNvPr id="1073073363" name=""/>
+                    <pic:cNvPicPr/>
+                  </pic:nvPicPr>
+                  <pic:blipFill>
+                    <a:blip r:embed="rId18"/>
+                    <a:stretch>
+                      <a:fillRect/>
+                    </a:stretch>
+                  </pic:blipFill>
+                  <pic:spPr>
+                    <a:xfrm>
+                      <a:off x="0" y="0"/>
+                      <a:ext cx="3017782" cy="1181202"/>
+                    </a:xfrm>
+                    <a:prstGeom prst="rect">
+                      <a:avLst/>
+                    </a:prstGeom>
+                  </pic:spPr>
+                </pic:pic>
+              </a:graphicData>
+            </a:graphic>
+          </wp:inline>
+        </w:drawing>
+      </w:r>
+    </w:p>
+    <w:p>
+      <w:pPr>
+        <w:pStyle w:val="Legenda"/>
+      </w:pPr>
+      <w:r>
+        <w:t xml:space="preserve">Figura </w:t>
+      </w:r>
+      <w:fldSimple w:instr=" SEQ Figura \* ARABIC ">
+        <w:r>
+          <w:rPr>
+            <w:noProof/>
+          </w:rPr>
+          <w:t>3</w:t>
+        </w:r>
+      </w:fldSimple>
+      <w:r>
+        <w:t xml:space="preserve"> Juramentos</w:t>
+      </w:r>
+    </w:p>
+    <w:p>
+      <w:r>
+        <w:t>Aproveitei para adicionar a cena “</w:t>
+      </w:r>
+      <w:proofErr w:type="spellStart"/>
+      <w:r>
+        <w:t>ResultsScreen</w:t>
+      </w:r>
+      <w:proofErr w:type="spellEnd"/>
+      <w:r>
+        <w:t>” que mostra então os juramentos todos do jogador, a pontuação final</w:t>
+      </w:r>
+      <w:r>
+        <w:t>, a precisão</w:t>
+      </w:r>
+      <w:r>
+        <w:t xml:space="preserve"> e o combo máximo.</w:t>
+      </w:r>
+    </w:p>
+    <w:p>
+      <w:pPr>
+        <w:keepNext/>
+      </w:pPr>
+      <w:r>
+        <w:drawing>
+          <wp:inline distT="0" distB="0" distL="0" distR="0" wp14:anchorId="43235BAE" wp14:editId="105830AE">
+            <wp:extent cx="6120130" cy="2955925"/>
+            <wp:effectExtent l="0" t="0" r="0" b="0"/>
+            <wp:docPr id="648618052" name="Imagem 1"/>
+            <wp:cNvGraphicFramePr>
+              <a:graphicFrameLocks xmlns:a="http://schemas.openxmlformats.org/drawingml/2006/main" noChangeAspect="1"/>
+            </wp:cNvGraphicFramePr>
+            <a:graphic xmlns:a="http://schemas.openxmlformats.org/drawingml/2006/main">
+              <a:graphicData uri="http://schemas.openxmlformats.org/drawingml/2006/picture">
+                <pic:pic xmlns:pic="http://schemas.openxmlformats.org/drawingml/2006/picture">
+                  <pic:nvPicPr>
+                    <pic:cNvPr id="648618052" name=""/>
+                    <pic:cNvPicPr/>
+                  </pic:nvPicPr>
+                  <pic:blipFill>
+                    <a:blip r:embed="rId19"/>
+                    <a:stretch>
+                      <a:fillRect/>
+                    </a:stretch>
+                  </pic:blipFill>
+                  <pic:spPr>
+                    <a:xfrm>
+                      <a:off x="0" y="0"/>
+                      <a:ext cx="6120130" cy="2955925"/>
+                    </a:xfrm>
+                    <a:prstGeom prst="rect">
+                      <a:avLst/>
+                    </a:prstGeom>
+                  </pic:spPr>
+                </pic:pic>
+              </a:graphicData>
+            </a:graphic>
+          </wp:inline>
+        </w:drawing>
+      </w:r>
+    </w:p>
+    <w:p>
+      <w:pPr>
+        <w:pStyle w:val="Legenda"/>
+      </w:pPr>
+      <w:r>
+        <w:t xml:space="preserve">Figura </w:t>
+      </w:r>
+      <w:fldSimple w:instr=" SEQ Figura \* ARABIC ">
+        <w:r>
+          <w:rPr>
+            <w:noProof/>
+          </w:rPr>
+          <w:t>4</w:t>
+        </w:r>
+      </w:fldSimple>
+      <w:r>
+        <w:t xml:space="preserve"> Cena </w:t>
+      </w:r>
+      <w:proofErr w:type="spellStart"/>
+      <w:r>
+        <w:t>ResultsScreen</w:t>
+      </w:r>
+      <w:proofErr w:type="spellEnd"/>
+    </w:p>
+    <w:p/>
+    <w:p/>
+    <w:p>
+      <w:r>
         <w:t>13/10/2026</w:t>
       </w:r>
     </w:p>
@@ -2220,6 +2417,7 @@
         <w:rPr>
           <w:noProof/>
         </w:rPr>
+        <w:lastRenderedPageBreak/>
         <w:drawing>
           <wp:inline distT="0" distB="0" distL="0" distR="0" wp14:anchorId="1697DBE0" wp14:editId="1C5F2434">
             <wp:extent cx="6120130" cy="2959100"/>
@@ -2236,7 +2434,7 @@
                     <pic:cNvPicPr/>
                   </pic:nvPicPr>
                   <pic:blipFill>
-                    <a:blip r:embed="rId18"/>
+                    <a:blip r:embed="rId20"/>
                     <a:stretch>
                       <a:fillRect/>
                     </a:stretch>
@@ -2269,7 +2467,7 @@
           <w:rPr>
             <w:noProof/>
           </w:rPr>
-          <w:t>3</w:t>
+          <w:t>5</w:t>
         </w:r>
       </w:fldSimple>
       <w:r>
@@ -2334,7 +2532,7 @@
                     <pic:cNvPicPr/>
                   </pic:nvPicPr>
                   <pic:blipFill>
-                    <a:blip r:embed="rId19"/>
+                    <a:blip r:embed="rId21"/>
                     <a:stretch>
                       <a:fillRect/>
                     </a:stretch>
@@ -2362,53 +2560,56 @@
     <w:p/>
     <w:p>
       <w:r>
+        <w:t>16/10/2026</w:t>
+      </w:r>
+    </w:p>
+    <w:p>
+      <w:r>
+        <w:t xml:space="preserve">Acabei as definições de volume na cena </w:t>
+      </w:r>
+      <w:proofErr w:type="spellStart"/>
+      <w:r>
+        <w:t>Settings</w:t>
+      </w:r>
+      <w:proofErr w:type="spellEnd"/>
+      <w:r>
+        <w:t xml:space="preserve"> e criei o script </w:t>
+      </w:r>
+      <w:proofErr w:type="spellStart"/>
+      <w:r>
+        <w:t>SettingsMenu.cs</w:t>
+      </w:r>
+      <w:proofErr w:type="spellEnd"/>
+      <w:r>
+        <w:t xml:space="preserve"> que faz a alteração do </w:t>
+      </w:r>
+      <w:proofErr w:type="spellStart"/>
+      <w:r>
+        <w:t>slider</w:t>
+      </w:r>
+      <w:proofErr w:type="spellEnd"/>
+      <w:r>
+        <w:t xml:space="preserve"> do volume e atribui o valor do </w:t>
+      </w:r>
+      <w:proofErr w:type="spellStart"/>
+      <w:r>
+        <w:t>slider</w:t>
+      </w:r>
+      <w:proofErr w:type="spellEnd"/>
+      <w:r>
+        <w:t xml:space="preserve"> aos </w:t>
+      </w:r>
+      <w:proofErr w:type="spellStart"/>
+      <w:r>
+        <w:t>PlayerPrefs</w:t>
+      </w:r>
+      <w:proofErr w:type="spellEnd"/>
+      <w:r>
+        <w:t xml:space="preserve"> para ficar guardado </w:t>
+      </w:r>
+      <w:r>
         <w:lastRenderedPageBreak/>
-        <w:t>16/10/2026</w:t>
-      </w:r>
-    </w:p>
-    <w:p>
-      <w:r>
-        <w:t xml:space="preserve">Acabei as definições de volume na cena </w:t>
-      </w:r>
-      <w:proofErr w:type="spellStart"/>
-      <w:r>
-        <w:t>Settings</w:t>
-      </w:r>
-      <w:proofErr w:type="spellEnd"/>
-      <w:r>
-        <w:t xml:space="preserve"> e criei o script </w:t>
-      </w:r>
-      <w:proofErr w:type="spellStart"/>
-      <w:r>
-        <w:t>SettingsMenu.cs</w:t>
-      </w:r>
-      <w:proofErr w:type="spellEnd"/>
-      <w:r>
-        <w:t xml:space="preserve"> que faz a alteração do </w:t>
-      </w:r>
-      <w:proofErr w:type="spellStart"/>
-      <w:r>
-        <w:t>slider</w:t>
-      </w:r>
-      <w:proofErr w:type="spellEnd"/>
-      <w:r>
-        <w:t xml:space="preserve"> do volume e atribui o valor do </w:t>
-      </w:r>
-      <w:proofErr w:type="spellStart"/>
-      <w:r>
-        <w:t>slider</w:t>
-      </w:r>
-      <w:proofErr w:type="spellEnd"/>
-      <w:r>
-        <w:t xml:space="preserve"> aos </w:t>
-      </w:r>
-      <w:proofErr w:type="spellStart"/>
-      <w:r>
-        <w:t>PlayerPrefs</w:t>
-      </w:r>
-      <w:proofErr w:type="spellEnd"/>
-      <w:r>
-        <w:t xml:space="preserve"> para ficar guardado mesmo depois de mudar de cena ou mesmo de sair do jogo. Adicionei também um botão para voltar ao menu principal na cena de escolha do </w:t>
+        <w:t xml:space="preserve">mesmo depois de mudar de cena ou mesmo de sair do jogo. Adicionei também um botão para voltar ao menu principal na cena de escolha do </w:t>
       </w:r>
       <w:proofErr w:type="spellStart"/>
       <w:r>
@@ -2443,7 +2644,7 @@
                     <pic:cNvPicPr/>
                   </pic:nvPicPr>
                   <pic:blipFill>
-                    <a:blip r:embed="rId20"/>
+                    <a:blip r:embed="rId22"/>
                     <a:stretch>
                       <a:fillRect/>
                     </a:stretch>
@@ -2476,7 +2677,7 @@
           <w:rPr>
             <w:noProof/>
           </w:rPr>
-          <w:t>4</w:t>
+          <w:t>6</w:t>
         </w:r>
       </w:fldSimple>
       <w:r>
@@ -2531,7 +2732,7 @@
                     <pic:cNvPicPr/>
                   </pic:nvPicPr>
                   <pic:blipFill>
-                    <a:blip r:embed="rId21"/>
+                    <a:blip r:embed="rId23"/>
                     <a:stretch>
                       <a:fillRect/>
                     </a:stretch>
@@ -2564,7 +2765,7 @@
           <w:rPr>
             <w:noProof/>
           </w:rPr>
-          <w:t>5</w:t>
+          <w:t>7</w:t>
         </w:r>
       </w:fldSimple>
       <w:r>
@@ -2578,26 +2779,26 @@
     </w:p>
     <w:p>
       <w:r>
+        <w:t xml:space="preserve">Depois de adicionar os elementos todos ao </w:t>
+      </w:r>
+      <w:proofErr w:type="spellStart"/>
+      <w:r>
+        <w:t>canvas</w:t>
+      </w:r>
+      <w:proofErr w:type="spellEnd"/>
+      <w:r>
+        <w:t xml:space="preserve"> estive a configurar as ancoras de cada elemento fazendo então este menu.</w:t>
+      </w:r>
+    </w:p>
+    <w:p>
+      <w:pPr>
+        <w:keepNext/>
+      </w:pPr>
+      <w:r>
+        <w:rPr>
+          <w:noProof/>
+        </w:rPr>
         <w:lastRenderedPageBreak/>
-        <w:t xml:space="preserve">Depois de adicionar os elementos todos ao </w:t>
-      </w:r>
-      <w:proofErr w:type="spellStart"/>
-      <w:r>
-        <w:t>canvas</w:t>
-      </w:r>
-      <w:proofErr w:type="spellEnd"/>
-      <w:r>
-        <w:t xml:space="preserve"> estive a configurar as ancoras de cada elemento fazendo então este menu.</w:t>
-      </w:r>
-    </w:p>
-    <w:p>
-      <w:pPr>
-        <w:keepNext/>
-      </w:pPr>
-      <w:r>
-        <w:rPr>
-          <w:noProof/>
-        </w:rPr>
         <w:drawing>
           <wp:inline distT="0" distB="0" distL="0" distR="0" wp14:anchorId="3EC0022C" wp14:editId="5B3774DA">
             <wp:extent cx="6120130" cy="2975610"/>
@@ -2614,7 +2815,7 @@
                     <pic:cNvPicPr/>
                   </pic:nvPicPr>
                   <pic:blipFill>
-                    <a:blip r:embed="rId22"/>
+                    <a:blip r:embed="rId24"/>
                     <a:stretch>
                       <a:fillRect/>
                     </a:stretch>
@@ -2647,7 +2848,7 @@
           <w:rPr>
             <w:noProof/>
           </w:rPr>
-          <w:t>6</w:t>
+          <w:t>8</w:t>
         </w:r>
       </w:fldSimple>
       <w:r>
@@ -2748,7 +2949,7 @@
                     <pic:cNvPicPr/>
                   </pic:nvPicPr>
                   <pic:blipFill>
-                    <a:blip r:embed="rId23"/>
+                    <a:blip r:embed="rId25"/>
                     <a:stretch>
                       <a:fillRect/>
                     </a:stretch>
@@ -2781,7 +2982,7 @@
           <w:rPr>
             <w:noProof/>
           </w:rPr>
-          <w:t>7</w:t>
+          <w:t>9</w:t>
         </w:r>
       </w:fldSimple>
       <w:r>
@@ -2798,10 +2999,12 @@
         <w:t xml:space="preserve">Aprendi também a usar o </w:t>
       </w:r>
       <w:proofErr w:type="spellStart"/>
+      <w:proofErr w:type="gramStart"/>
       <w:r>
         <w:t>float.TryParse</w:t>
       </w:r>
       <w:proofErr w:type="spellEnd"/>
+      <w:proofErr w:type="gramEnd"/>
       <w:r>
         <w:t xml:space="preserve"> para fazer validação dos inputs do jogador como mostrado na imagem acima.</w:t>
       </w:r>
@@ -2830,13 +3033,18 @@
       </w:r>
       <w:proofErr w:type="spellEnd"/>
       <w:r>
-        <w:t xml:space="preserve"> e depois criando uma pasta para guardar esses ficheiros .</w:t>
+        <w:t xml:space="preserve"> e depois criando uma pasta para guardar esses </w:t>
+      </w:r>
+      <w:proofErr w:type="gramStart"/>
+      <w:r>
+        <w:t>ficheiros .</w:t>
       </w:r>
       <w:proofErr w:type="spellStart"/>
       <w:r>
         <w:t>json</w:t>
       </w:r>
       <w:proofErr w:type="spellEnd"/>
+      <w:proofErr w:type="gramEnd"/>
       <w:r>
         <w:t xml:space="preserve"> com as informações do </w:t>
       </w:r>
@@ -2854,6 +3062,9 @@
         <w:keepNext/>
       </w:pPr>
       <w:r>
+        <w:rPr>
+          <w:noProof/>
+        </w:rPr>
         <w:lastRenderedPageBreak/>
         <w:drawing>
           <wp:inline distT="0" distB="0" distL="0" distR="0" wp14:anchorId="21DEEFEB" wp14:editId="00A6DDEC">
@@ -2871,7 +3082,7 @@
                     <pic:cNvPicPr/>
                   </pic:nvPicPr>
                   <pic:blipFill>
-                    <a:blip r:embed="rId24"/>
+                    <a:blip r:embed="rId26"/>
                     <a:stretch>
                       <a:fillRect/>
                     </a:stretch>
@@ -2904,7 +3115,7 @@
           <w:rPr>
             <w:noProof/>
           </w:rPr>
-          <w:t>8</w:t>
+          <w:t>10</w:t>
         </w:r>
       </w:fldSimple>
       <w:r>
@@ -2918,13 +3129,18 @@
     </w:p>
     <w:p>
       <w:r>
-        <w:t>Adicionei mais duas funções. Uma função para carregar os valores guardados no .</w:t>
+        <w:t xml:space="preserve">Adicionei mais duas funções. Uma função para carregar os valores guardados </w:t>
+      </w:r>
+      <w:proofErr w:type="gramStart"/>
+      <w:r>
+        <w:t>no .</w:t>
       </w:r>
       <w:proofErr w:type="spellStart"/>
       <w:r>
         <w:t>json</w:t>
       </w:r>
       <w:proofErr w:type="spellEnd"/>
+      <w:proofErr w:type="gramEnd"/>
       <w:r>
         <w:t xml:space="preserve"> do </w:t>
       </w:r>
@@ -2934,13 +3150,18 @@
       </w:r>
       <w:proofErr w:type="spellEnd"/>
       <w:r>
-        <w:t xml:space="preserve"> para assim não ser preciso estar sempre a por os valores de volta quando se abre o jogo. E outra para não ter que estar sempre a procurar o caminho do .</w:t>
+        <w:t xml:space="preserve"> para assim não ser preciso estar sempre a por os valores de volta quando se abre o jogo. E outra para não ter que estar sempre a procurar o caminho </w:t>
+      </w:r>
+      <w:proofErr w:type="gramStart"/>
+      <w:r>
+        <w:t>do .</w:t>
       </w:r>
       <w:proofErr w:type="spellStart"/>
       <w:r>
         <w:t>json</w:t>
       </w:r>
       <w:proofErr w:type="spellEnd"/>
+      <w:proofErr w:type="gramEnd"/>
       <w:r>
         <w:t xml:space="preserve"> sempre que crio uma função nova que precise do mesmo.</w:t>
       </w:r>
@@ -2950,6 +3171,9 @@
         <w:keepNext/>
       </w:pPr>
       <w:r>
+        <w:rPr>
+          <w:noProof/>
+        </w:rPr>
         <w:lastRenderedPageBreak/>
         <w:drawing>
           <wp:inline distT="0" distB="0" distL="0" distR="0" wp14:anchorId="4548B0BC" wp14:editId="496C06B8">
@@ -2967,7 +3191,7 @@
                     <pic:cNvPicPr/>
                   </pic:nvPicPr>
                   <pic:blipFill>
-                    <a:blip r:embed="rId25"/>
+                    <a:blip r:embed="rId27"/>
                     <a:stretch>
                       <a:fillRect/>
                     </a:stretch>
@@ -3000,7 +3224,7 @@
           <w:rPr>
             <w:noProof/>
           </w:rPr>
-          <w:t>9</w:t>
+          <w:t>11</w:t>
         </w:r>
       </w:fldSimple>
       <w:r>
@@ -3017,6 +3241,9 @@
         <w:keepNext/>
       </w:pPr>
       <w:r>
+        <w:rPr>
+          <w:noProof/>
+        </w:rPr>
         <w:drawing>
           <wp:inline distT="0" distB="0" distL="0" distR="0" wp14:anchorId="7B99E96E" wp14:editId="681B1DCE">
             <wp:extent cx="6120130" cy="2024380"/>
@@ -3033,7 +3260,7 @@
                     <pic:cNvPicPr/>
                   </pic:nvPicPr>
                   <pic:blipFill>
-                    <a:blip r:embed="rId26"/>
+                    <a:blip r:embed="rId28"/>
                     <a:stretch>
                       <a:fillRect/>
                     </a:stretch>
@@ -3066,7 +3293,7 @@
           <w:rPr>
             <w:noProof/>
           </w:rPr>
-          <w:t>10</w:t>
+          <w:t>12</w:t>
         </w:r>
       </w:fldSimple>
       <w:r>
@@ -3077,19 +3304,70 @@
         <w:t>GetMetadataFilePath</w:t>
       </w:r>
       <w:proofErr w:type="spellEnd"/>
+    </w:p>
+    <w:p/>
+    <w:p>
+      <w:r>
+        <w:t>21/10/2026</w:t>
+      </w:r>
+    </w:p>
+    <w:p>
+      <w:r>
+        <w:t>As alterações feitas na cena “</w:t>
+      </w:r>
+      <w:proofErr w:type="spellStart"/>
+      <w:r>
+        <w:t>BeatmapEdit</w:t>
+      </w:r>
+      <w:proofErr w:type="spellEnd"/>
+      <w:r>
+        <w:t xml:space="preserve">” são agora passadas </w:t>
+      </w:r>
+      <w:r>
+        <w:t>para a cena “</w:t>
+      </w:r>
+      <w:proofErr w:type="spellStart"/>
+      <w:r>
+        <w:t>MusicPlay</w:t>
+      </w:r>
+      <w:proofErr w:type="spellEnd"/>
+      <w:r>
+        <w:t xml:space="preserve">”, fazendo possível alterar o </w:t>
+      </w:r>
+      <w:proofErr w:type="spellStart"/>
+      <w:r>
+        <w:t>bpm</w:t>
+      </w:r>
+      <w:proofErr w:type="spellEnd"/>
+      <w:r>
+        <w:t xml:space="preserve"> ou o offset de </w:t>
+      </w:r>
+      <w:proofErr w:type="spellStart"/>
+      <w:r>
+        <w:t>beatmaps</w:t>
+      </w:r>
+      <w:proofErr w:type="spellEnd"/>
+      <w:r>
+        <w:t>.</w:t>
+      </w:r>
+      <w:r>
+        <w:t xml:space="preserve"> Comecei a trabalhar n</w:t>
+      </w:r>
+      <w:r>
+        <w:t>o Desenvolvimento do Projeto no relatório.</w:t>
+      </w:r>
     </w:p>
     <w:p/>
     <w:p/>
     <w:p/>
-    <w:p/>
-    <w:p>
-      <w:r>
+    <w:p>
+      <w:r>
+        <w:lastRenderedPageBreak/>
         <w:t>O desenvolvimento é o "grosso" do trabalho de relatório e deve explicar de forma organizada, o caminho percorrido, as reflexões sobre os problemas levantados e as justificações das posições tomadas. Pode ser dividido em subtemas ou em capítulos com títulos e subtítulos.</w:t>
       </w:r>
     </w:p>
     <w:p>
       <w:r>
-        <w:lastRenderedPageBreak/>
         <w:t>Num relatório de projeto, as questões ligadas à conceção de uma solução assumem grande importância, sendo trabalhos onde, em geral, há um</w:t>
       </w:r>
       <w:r>
@@ -3143,7 +3421,15 @@
         </w:numPr>
       </w:pPr>
       <w:r>
-        <w:t>recorrer a documentação técnica e a abstrações para apresentar e documentar a solução desenvolvida e a sua arquitetura</w:t>
+        <w:t xml:space="preserve">recorrer </w:t>
+      </w:r>
+      <w:proofErr w:type="gramStart"/>
+      <w:r>
+        <w:t>a</w:t>
+      </w:r>
+      <w:proofErr w:type="gramEnd"/>
+      <w:r>
+        <w:t xml:space="preserve"> documentação técnica e a abstrações para apresentar e documentar a solução desenvolvida e a sua arquitetura</w:t>
       </w:r>
       <w:r>
         <w:t>.</w:t>
@@ -3640,7 +3926,7 @@
         </w:rPr>
         <w:t xml:space="preserve">Acedido em 31 de julho de 2012 através de </w:t>
       </w:r>
-      <w:hyperlink r:id="rId27" w:anchor="reader_1412975417" w:history="1">
+      <w:hyperlink r:id="rId29" w:anchor="reader_1412975417" w:history="1">
         <w:r>
           <w:rPr>
             <w:rStyle w:val="Hiperligao"/>
@@ -3898,7 +4184,15 @@
     </w:p>
     <w:p>
       <w:r>
-        <w:t xml:space="preserve">As frases utilizadas devem ser completas mas sucintas, para que, através da sua leitura seja possível seguir um raciocínio lógico. A forma como o texto é escrito é importante para a qualidade do relatório. </w:t>
+        <w:t xml:space="preserve">As frases utilizadas devem ser </w:t>
+      </w:r>
+      <w:proofErr w:type="gramStart"/>
+      <w:r>
+        <w:t>completas</w:t>
+      </w:r>
+      <w:proofErr w:type="gramEnd"/>
+      <w:r>
+        <w:t xml:space="preserve"> mas sucintas, para que, através da sua leitura seja possível seguir um raciocínio lógico. A forma como o texto é escrito é importante para a qualidade do relatório. </w:t>
       </w:r>
     </w:p>
     <w:p>
@@ -3906,11 +4200,16 @@
         <w:t>Em primeiro lugar,</w:t>
       </w:r>
       <w:r>
-        <w:t xml:space="preserve"> a ausência de erros (gramaticais e de ortografia) é essencial. A primeira impressão de quem lê um texto é dada pela correção formal do texto. Um texto com </w:t>
+        <w:t xml:space="preserve"> a ausência de erros (gramaticais e de ortografia) é essencial. A primeira impressão de quem lê um texto é dada pela correção formal do texto. </w:t>
+      </w:r>
+      <w:proofErr w:type="gramStart"/>
+      <w:r>
+        <w:t xml:space="preserve">Um texto com </w:t>
       </w:r>
       <w:r>
         <w:t>erros em nada abonam</w:t>
       </w:r>
+      <w:proofErr w:type="gramEnd"/>
       <w:r>
         <w:t xml:space="preserve"> a favor de </w:t>
       </w:r>
@@ -3922,10 +4221,10 @@
       </w:r>
     </w:p>
     <w:sectPr>
-      <w:headerReference w:type="default" r:id="rId28"/>
-      <w:footerReference w:type="default" r:id="rId29"/>
-      <w:headerReference w:type="first" r:id="rId30"/>
-      <w:footerReference w:type="first" r:id="rId31"/>
+      <w:headerReference w:type="default" r:id="rId30"/>
+      <w:footerReference w:type="default" r:id="rId31"/>
+      <w:headerReference w:type="first" r:id="rId32"/>
+      <w:footerReference w:type="first" r:id="rId33"/>
       <w:type w:val="continuous"/>
       <w:pgSz w:w="11906" w:h="16838"/>
       <w:pgMar w:top="1134" w:right="1134" w:bottom="1134" w:left="1134" w:header="709" w:footer="709" w:gutter="0"/>

</xml_diff>